<commit_message>
Add investor pitch deck with portal branding and clearer figure labels.
Build a 10-slide executive pitch (ASAL gap, gated ask, sources/AI cite) and align report figures to ElimuMatch portal colors and plain-language labels.

Co-authored-by: Cursor <cursoragent@cursor.com>
</commit_message>
<xml_diff>
--- a/ElimuMatch_Investor_Brief.docx
+++ b/ElimuMatch_Investor_Brief.docx
@@ -9,29 +9,18 @@
         <w:rPr>
           <w:rFonts w:ascii="Bierstadt Display" w:eastAsia="Calibri" w:hAnsi="Bierstadt Display"/>
           <w:bCs/>
-          <w:sz w:val="44"/>
-          <w:szCs w:val="44"/>
-        </w:rPr>
-      </w:pPr>
-      <w:proofErr w:type="spellStart"/>
+          <w:sz w:val="40"/>
+          <w:szCs w:val="40"/>
+        </w:rPr>
+      </w:pPr>
       <w:r>
         <w:rPr>
           <w:rFonts w:ascii="Bierstadt Display" w:eastAsia="Calibri" w:hAnsi="Bierstadt Display"/>
           <w:bCs/>
-          <w:sz w:val="44"/>
-          <w:szCs w:val="44"/>
-        </w:rPr>
-        <w:t>ElimuMatch</w:t>
-      </w:r>
-      <w:proofErr w:type="spellEnd"/>
-      <w:r>
-        <w:rPr>
-          <w:rFonts w:ascii="Bierstadt Display" w:eastAsia="Calibri" w:hAnsi="Bierstadt Display"/>
-          <w:bCs/>
-          <w:sz w:val="44"/>
-          <w:szCs w:val="44"/>
-        </w:rPr>
-        <w:t>: Matching Support to Retention Risk</w:t>
+          <w:sz w:val="40"/>
+          <w:szCs w:val="40"/>
+        </w:rPr>
+        <w:t>ElimuMatch: Matching Support to Retention Risk</w:t>
       </w:r>
     </w:p>
     <w:p>
@@ -123,6 +112,19 @@
         <w:spacing w:before="280" w:after="80"/>
         <w:jc w:val="center"/>
         <w:rPr>
+          <w:rStyle w:val="Emphasis"/>
+          <w:rFonts w:ascii="Bierstadt Display" w:hAnsi="Bierstadt Display" w:cs="Segoe UI"/>
+          <w:sz w:val="20"/>
+          <w:szCs w:val="20"/>
+          <w:shd w:val="clear" w:color="auto" w:fill="FCFCFC"/>
+        </w:rPr>
+      </w:pPr>
+    </w:p>
+    <w:p>
+      <w:pPr>
+        <w:spacing w:before="280" w:after="80"/>
+        <w:jc w:val="center"/>
+        <w:rPr>
           <w:rFonts w:ascii="Bierstadt Display" w:hAnsi="Bierstadt Display"/>
         </w:rPr>
       </w:pPr>
@@ -234,6 +236,16 @@
     </w:p>
     <w:p>
       <w:pPr>
+        <w:spacing w:before="40" w:after="40"/>
+        <w:jc w:val="center"/>
+        <w:rPr>
+          <w:rFonts w:ascii="Bierstadt Display" w:eastAsia="Calibri" w:hAnsi="Bierstadt Display"/>
+          <w:sz w:val="24"/>
+        </w:rPr>
+      </w:pPr>
+    </w:p>
+    <w:p>
+      <w:pPr>
         <w:spacing w:before="280" w:after="80"/>
         <w:jc w:val="center"/>
         <w:rPr>
@@ -279,17 +291,8 @@
           <w:rFonts w:ascii="Bierstadt Display" w:eastAsia="Calibri" w:hAnsi="Bierstadt Display"/>
           <w:sz w:val="24"/>
         </w:rPr>
-        <w:t xml:space="preserve">Founder, </w:t>
-      </w:r>
-      <w:proofErr w:type="spellStart"/>
-      <w:r>
-        <w:rPr>
-          <w:rFonts w:ascii="Bierstadt Display" w:eastAsia="Calibri" w:hAnsi="Bierstadt Display"/>
-          <w:sz w:val="24"/>
-        </w:rPr>
-        <w:t>ElimuMatch</w:t>
-      </w:r>
-      <w:proofErr w:type="spellEnd"/>
+        <w:t>Founder, ElimuMatch</w:t>
+      </w:r>
     </w:p>
     <w:p>
       <w:pPr>
@@ -416,7 +419,7 @@
             </w:rPr>
             <w:fldChar w:fldCharType="separate"/>
           </w:r>
-          <w:hyperlink w:anchor="_Toc239352121" w:history="1">
+          <w:hyperlink w:anchor="_Toc239360050" w:history="1">
             <w:r>
               <w:rPr>
                 <w:rStyle w:val="Hyperlink"/>
@@ -444,7 +447,7 @@
                 <w:noProof/>
                 <w:webHidden/>
               </w:rPr>
-              <w:instrText xml:space="preserve"> PAGEREF _Toc239352121 \h </w:instrText>
+              <w:instrText xml:space="preserve"> PAGEREF _Toc239360050 \h </w:instrText>
             </w:r>
             <w:r>
               <w:rPr>
@@ -488,7 +491,7 @@
               <w14:ligatures w14:val="standardContextual"/>
             </w:rPr>
           </w:pPr>
-          <w:hyperlink w:anchor="_Toc239352122" w:history="1">
+          <w:hyperlink w:anchor="_Toc239360051" w:history="1">
             <w:r>
               <w:rPr>
                 <w:rStyle w:val="Hyperlink"/>
@@ -516,7 +519,7 @@
                 <w:noProof/>
                 <w:webHidden/>
               </w:rPr>
-              <w:instrText xml:space="preserve"> PAGEREF _Toc239352122 \h </w:instrText>
+              <w:instrText xml:space="preserve"> PAGEREF _Toc239360051 \h </w:instrText>
             </w:r>
             <w:r>
               <w:rPr>
@@ -560,7 +563,7 @@
               <w14:ligatures w14:val="standardContextual"/>
             </w:rPr>
           </w:pPr>
-          <w:hyperlink w:anchor="_Toc239352123" w:history="1">
+          <w:hyperlink w:anchor="_Toc239360052" w:history="1">
             <w:r>
               <w:rPr>
                 <w:rStyle w:val="Hyperlink"/>
@@ -588,7 +591,7 @@
                 <w:noProof/>
                 <w:webHidden/>
               </w:rPr>
-              <w:instrText xml:space="preserve"> PAGEREF _Toc239352123 \h </w:instrText>
+              <w:instrText xml:space="preserve"> PAGEREF _Toc239360052 \h </w:instrText>
             </w:r>
             <w:r>
               <w:rPr>
@@ -632,14 +635,14 @@
               <w14:ligatures w14:val="standardContextual"/>
             </w:rPr>
           </w:pPr>
-          <w:hyperlink w:anchor="_Toc239352124" w:history="1">
+          <w:hyperlink w:anchor="_Toc239360053" w:history="1">
             <w:r>
               <w:rPr>
                 <w:rStyle w:val="Hyperlink"/>
                 <w:rFonts w:ascii="Bierstadt Display" w:hAnsi="Bierstadt Display"/>
                 <w:noProof/>
               </w:rPr>
-              <w:t>4. Team</w:t>
+              <w:t>4. ElimuMatch Team</w:t>
             </w:r>
             <w:r>
               <w:rPr>
@@ -660,7 +663,7 @@
                 <w:noProof/>
                 <w:webHidden/>
               </w:rPr>
-              <w:instrText xml:space="preserve"> PAGEREF _Toc239352124 \h </w:instrText>
+              <w:instrText xml:space="preserve"> PAGEREF _Toc239360053 \h </w:instrText>
             </w:r>
             <w:r>
               <w:rPr>
@@ -704,7 +707,7 @@
               <w14:ligatures w14:val="standardContextual"/>
             </w:rPr>
           </w:pPr>
-          <w:hyperlink w:anchor="_Toc239352125" w:history="1">
+          <w:hyperlink w:anchor="_Toc239360054" w:history="1">
             <w:r>
               <w:rPr>
                 <w:rStyle w:val="Hyperlink"/>
@@ -732,7 +735,7 @@
                 <w:noProof/>
                 <w:webHidden/>
               </w:rPr>
-              <w:instrText xml:space="preserve"> PAGEREF _Toc239352125 \h </w:instrText>
+              <w:instrText xml:space="preserve"> PAGEREF _Toc239360054 \h </w:instrText>
             </w:r>
             <w:r>
               <w:rPr>
@@ -776,7 +779,7 @@
               <w14:ligatures w14:val="standardContextual"/>
             </w:rPr>
           </w:pPr>
-          <w:hyperlink w:anchor="_Toc239352126" w:history="1">
+          <w:hyperlink w:anchor="_Toc239360055" w:history="1">
             <w:r>
               <w:rPr>
                 <w:rStyle w:val="Hyperlink"/>
@@ -804,7 +807,7 @@
                 <w:noProof/>
                 <w:webHidden/>
               </w:rPr>
-              <w:instrText xml:space="preserve"> PAGEREF _Toc239352126 \h </w:instrText>
+              <w:instrText xml:space="preserve"> PAGEREF _Toc239360055 \h </w:instrText>
             </w:r>
             <w:r>
               <w:rPr>
@@ -848,7 +851,7 @@
               <w14:ligatures w14:val="standardContextual"/>
             </w:rPr>
           </w:pPr>
-          <w:hyperlink w:anchor="_Toc239352127" w:history="1">
+          <w:hyperlink w:anchor="_Toc239360056" w:history="1">
             <w:r>
               <w:rPr>
                 <w:rStyle w:val="Hyperlink"/>
@@ -876,7 +879,7 @@
                 <w:noProof/>
                 <w:webHidden/>
               </w:rPr>
-              <w:instrText xml:space="preserve"> PAGEREF _Toc239352127 \h </w:instrText>
+              <w:instrText xml:space="preserve"> PAGEREF _Toc239360056 \h </w:instrText>
             </w:r>
             <w:r>
               <w:rPr>
@@ -920,7 +923,7 @@
               <w14:ligatures w14:val="standardContextual"/>
             </w:rPr>
           </w:pPr>
-          <w:hyperlink w:anchor="_Toc239352128" w:history="1">
+          <w:hyperlink w:anchor="_Toc239360057" w:history="1">
             <w:r>
               <w:rPr>
                 <w:rStyle w:val="Hyperlink"/>
@@ -948,7 +951,7 @@
                 <w:noProof/>
                 <w:webHidden/>
               </w:rPr>
-              <w:instrText xml:space="preserve"> PAGEREF _Toc239352128 \h </w:instrText>
+              <w:instrText xml:space="preserve"> PAGEREF _Toc239360057 \h </w:instrText>
             </w:r>
             <w:r>
               <w:rPr>
@@ -992,7 +995,7 @@
               <w14:ligatures w14:val="standardContextual"/>
             </w:rPr>
           </w:pPr>
-          <w:hyperlink w:anchor="_Toc239352129" w:history="1">
+          <w:hyperlink w:anchor="_Toc239360058" w:history="1">
             <w:r>
               <w:rPr>
                 <w:rStyle w:val="Hyperlink"/>
@@ -1020,7 +1023,7 @@
                 <w:noProof/>
                 <w:webHidden/>
               </w:rPr>
-              <w:instrText xml:space="preserve"> PAGEREF _Toc239352129 \h </w:instrText>
+              <w:instrText xml:space="preserve"> PAGEREF _Toc239360058 \h </w:instrText>
             </w:r>
             <w:r>
               <w:rPr>
@@ -1064,7 +1067,7 @@
               <w14:ligatures w14:val="standardContextual"/>
             </w:rPr>
           </w:pPr>
-          <w:hyperlink w:anchor="_Toc239352130" w:history="1">
+          <w:hyperlink w:anchor="_Toc239360059" w:history="1">
             <w:r>
               <w:rPr>
                 <w:rStyle w:val="Hyperlink"/>
@@ -1092,7 +1095,7 @@
                 <w:noProof/>
                 <w:webHidden/>
               </w:rPr>
-              <w:instrText xml:space="preserve"> PAGEREF _Toc239352130 \h </w:instrText>
+              <w:instrText xml:space="preserve"> PAGEREF _Toc239360059 \h </w:instrText>
             </w:r>
             <w:r>
               <w:rPr>
@@ -1136,7 +1139,7 @@
               <w14:ligatures w14:val="standardContextual"/>
             </w:rPr>
           </w:pPr>
-          <w:hyperlink w:anchor="_Toc239352131" w:history="1">
+          <w:hyperlink w:anchor="_Toc239360060" w:history="1">
             <w:r>
               <w:rPr>
                 <w:rStyle w:val="Hyperlink"/>
@@ -1164,7 +1167,7 @@
                 <w:noProof/>
                 <w:webHidden/>
               </w:rPr>
-              <w:instrText xml:space="preserve"> PAGEREF _Toc239352131 \h </w:instrText>
+              <w:instrText xml:space="preserve"> PAGEREF _Toc239360060 \h </w:instrText>
             </w:r>
             <w:r>
               <w:rPr>
@@ -1208,7 +1211,7 @@
               <w14:ligatures w14:val="standardContextual"/>
             </w:rPr>
           </w:pPr>
-          <w:hyperlink w:anchor="_Toc239352132" w:history="1">
+          <w:hyperlink w:anchor="_Toc239360061" w:history="1">
             <w:r>
               <w:rPr>
                 <w:rStyle w:val="Hyperlink"/>
@@ -1236,7 +1239,7 @@
                 <w:noProof/>
                 <w:webHidden/>
               </w:rPr>
-              <w:instrText xml:space="preserve"> PAGEREF _Toc239352132 \h </w:instrText>
+              <w:instrText xml:space="preserve"> PAGEREF _Toc239360061 \h </w:instrText>
             </w:r>
             <w:r>
               <w:rPr>
@@ -1280,7 +1283,7 @@
               <w14:ligatures w14:val="standardContextual"/>
             </w:rPr>
           </w:pPr>
-          <w:hyperlink w:anchor="_Toc239352133" w:history="1">
+          <w:hyperlink w:anchor="_Toc239360062" w:history="1">
             <w:r>
               <w:rPr>
                 <w:rStyle w:val="Hyperlink"/>
@@ -1308,7 +1311,7 @@
                 <w:noProof/>
                 <w:webHidden/>
               </w:rPr>
-              <w:instrText xml:space="preserve"> PAGEREF _Toc239352133 \h </w:instrText>
+              <w:instrText xml:space="preserve"> PAGEREF _Toc239360062 \h </w:instrText>
             </w:r>
             <w:r>
               <w:rPr>
@@ -1352,7 +1355,7 @@
               <w14:ligatures w14:val="standardContextual"/>
             </w:rPr>
           </w:pPr>
-          <w:hyperlink w:anchor="_Toc239352134" w:history="1">
+          <w:hyperlink w:anchor="_Toc239360063" w:history="1">
             <w:r>
               <w:rPr>
                 <w:rStyle w:val="Hyperlink"/>
@@ -1380,7 +1383,7 @@
                 <w:noProof/>
                 <w:webHidden/>
               </w:rPr>
-              <w:instrText xml:space="preserve"> PAGEREF _Toc239352134 \h </w:instrText>
+              <w:instrText xml:space="preserve"> PAGEREF _Toc239360063 \h </w:instrText>
             </w:r>
             <w:r>
               <w:rPr>
@@ -1424,7 +1427,7 @@
               <w14:ligatures w14:val="standardContextual"/>
             </w:rPr>
           </w:pPr>
-          <w:hyperlink w:anchor="_Toc239352135" w:history="1">
+          <w:hyperlink w:anchor="_Toc239360064" w:history="1">
             <w:r>
               <w:rPr>
                 <w:rStyle w:val="Hyperlink"/>
@@ -1452,7 +1455,7 @@
                 <w:noProof/>
                 <w:webHidden/>
               </w:rPr>
-              <w:instrText xml:space="preserve"> PAGEREF _Toc239352135 \h </w:instrText>
+              <w:instrText xml:space="preserve"> PAGEREF _Toc239360064 \h </w:instrText>
             </w:r>
             <w:r>
               <w:rPr>
@@ -1496,7 +1499,7 @@
               <w14:ligatures w14:val="standardContextual"/>
             </w:rPr>
           </w:pPr>
-          <w:hyperlink w:anchor="_Toc239352136" w:history="1">
+          <w:hyperlink w:anchor="_Toc239360065" w:history="1">
             <w:r>
               <w:rPr>
                 <w:rStyle w:val="Hyperlink"/>
@@ -1524,7 +1527,7 @@
                 <w:noProof/>
                 <w:webHidden/>
               </w:rPr>
-              <w:instrText xml:space="preserve"> PAGEREF _Toc239352136 \h </w:instrText>
+              <w:instrText xml:space="preserve"> PAGEREF _Toc239360065 \h </w:instrText>
             </w:r>
             <w:r>
               <w:rPr>
@@ -1568,7 +1571,7 @@
               <w14:ligatures w14:val="standardContextual"/>
             </w:rPr>
           </w:pPr>
-          <w:hyperlink w:anchor="_Toc239352137" w:history="1">
+          <w:hyperlink w:anchor="_Toc239360066" w:history="1">
             <w:r>
               <w:rPr>
                 <w:rStyle w:val="Hyperlink"/>
@@ -1596,7 +1599,7 @@
                 <w:noProof/>
                 <w:webHidden/>
               </w:rPr>
-              <w:instrText xml:space="preserve"> PAGEREF _Toc239352137 \h </w:instrText>
+              <w:instrText xml:space="preserve"> PAGEREF _Toc239360066 \h </w:instrText>
             </w:r>
             <w:r>
               <w:rPr>
@@ -1640,7 +1643,7 @@
               <w14:ligatures w14:val="standardContextual"/>
             </w:rPr>
           </w:pPr>
-          <w:hyperlink w:anchor="_Toc239352138" w:history="1">
+          <w:hyperlink w:anchor="_Toc239360067" w:history="1">
             <w:r>
               <w:rPr>
                 <w:rStyle w:val="Hyperlink"/>
@@ -1668,7 +1671,7 @@
                 <w:noProof/>
                 <w:webHidden/>
               </w:rPr>
-              <w:instrText xml:space="preserve"> PAGEREF _Toc239352138 \h </w:instrText>
+              <w:instrText xml:space="preserve"> PAGEREF _Toc239360067 \h </w:instrText>
             </w:r>
             <w:r>
               <w:rPr>
@@ -1712,7 +1715,7 @@
               <w14:ligatures w14:val="standardContextual"/>
             </w:rPr>
           </w:pPr>
-          <w:hyperlink w:anchor="_Toc239352139" w:history="1">
+          <w:hyperlink w:anchor="_Toc239360068" w:history="1">
             <w:r>
               <w:rPr>
                 <w:rStyle w:val="Hyperlink"/>
@@ -1740,7 +1743,7 @@
                 <w:noProof/>
                 <w:webHidden/>
               </w:rPr>
-              <w:instrText xml:space="preserve"> PAGEREF _Toc239352139 \h </w:instrText>
+              <w:instrText xml:space="preserve"> PAGEREF _Toc239360068 \h </w:instrText>
             </w:r>
             <w:r>
               <w:rPr>
@@ -1784,7 +1787,7 @@
               <w14:ligatures w14:val="standardContextual"/>
             </w:rPr>
           </w:pPr>
-          <w:hyperlink w:anchor="_Toc239352140" w:history="1">
+          <w:hyperlink w:anchor="_Toc239360069" w:history="1">
             <w:r>
               <w:rPr>
                 <w:rStyle w:val="Hyperlink"/>
@@ -1812,7 +1815,7 @@
                 <w:noProof/>
                 <w:webHidden/>
               </w:rPr>
-              <w:instrText xml:space="preserve"> PAGEREF _Toc239352140 \h </w:instrText>
+              <w:instrText xml:space="preserve"> PAGEREF _Toc239360069 \h </w:instrText>
             </w:r>
             <w:r>
               <w:rPr>
@@ -1856,7 +1859,7 @@
               <w14:ligatures w14:val="standardContextual"/>
             </w:rPr>
           </w:pPr>
-          <w:hyperlink w:anchor="_Toc239352141" w:history="1">
+          <w:hyperlink w:anchor="_Toc239360070" w:history="1">
             <w:r>
               <w:rPr>
                 <w:rStyle w:val="Hyperlink"/>
@@ -1884,7 +1887,7 @@
                 <w:noProof/>
                 <w:webHidden/>
               </w:rPr>
-              <w:instrText xml:space="preserve"> PAGEREF _Toc239352141 \h </w:instrText>
+              <w:instrText xml:space="preserve"> PAGEREF _Toc239360070 \h </w:instrText>
             </w:r>
             <w:r>
               <w:rPr>
@@ -1928,7 +1931,7 @@
               <w14:ligatures w14:val="standardContextual"/>
             </w:rPr>
           </w:pPr>
-          <w:hyperlink w:anchor="_Toc239352142" w:history="1">
+          <w:hyperlink w:anchor="_Toc239360071" w:history="1">
             <w:r>
               <w:rPr>
                 <w:rStyle w:val="Hyperlink"/>
@@ -1956,7 +1959,7 @@
                 <w:noProof/>
                 <w:webHidden/>
               </w:rPr>
-              <w:instrText xml:space="preserve"> PAGEREF _Toc239352142 \h </w:instrText>
+              <w:instrText xml:space="preserve"> PAGEREF _Toc239360071 \h </w:instrText>
             </w:r>
             <w:r>
               <w:rPr>
@@ -2000,7 +2003,7 @@
               <w14:ligatures w14:val="standardContextual"/>
             </w:rPr>
           </w:pPr>
-          <w:hyperlink w:anchor="_Toc239352143" w:history="1">
+          <w:hyperlink w:anchor="_Toc239360072" w:history="1">
             <w:r>
               <w:rPr>
                 <w:rStyle w:val="Hyperlink"/>
@@ -2028,7 +2031,7 @@
                 <w:noProof/>
                 <w:webHidden/>
               </w:rPr>
-              <w:instrText xml:space="preserve"> PAGEREF _Toc239352143 \h </w:instrText>
+              <w:instrText xml:space="preserve"> PAGEREF _Toc239360072 \h </w:instrText>
             </w:r>
             <w:r>
               <w:rPr>
@@ -2072,7 +2075,7 @@
               <w14:ligatures w14:val="standardContextual"/>
             </w:rPr>
           </w:pPr>
-          <w:hyperlink w:anchor="_Toc239352144" w:history="1">
+          <w:hyperlink w:anchor="_Toc239360073" w:history="1">
             <w:r>
               <w:rPr>
                 <w:rStyle w:val="Hyperlink"/>
@@ -2100,7 +2103,7 @@
                 <w:noProof/>
                 <w:webHidden/>
               </w:rPr>
-              <w:instrText xml:space="preserve"> PAGEREF _Toc239352144 \h </w:instrText>
+              <w:instrText xml:space="preserve"> PAGEREF _Toc239360073 \h </w:instrText>
             </w:r>
             <w:r>
               <w:rPr>
@@ -2144,7 +2147,7 @@
               <w14:ligatures w14:val="standardContextual"/>
             </w:rPr>
           </w:pPr>
-          <w:hyperlink w:anchor="_Toc239352145" w:history="1">
+          <w:hyperlink w:anchor="_Toc239360074" w:history="1">
             <w:r>
               <w:rPr>
                 <w:rStyle w:val="Hyperlink"/>
@@ -2172,7 +2175,7 @@
                 <w:noProof/>
                 <w:webHidden/>
               </w:rPr>
-              <w:instrText xml:space="preserve"> PAGEREF _Toc239352145 \h </w:instrText>
+              <w:instrText xml:space="preserve"> PAGEREF _Toc239360074 \h </w:instrText>
             </w:r>
             <w:r>
               <w:rPr>
@@ -2216,7 +2219,7 @@
               <w14:ligatures w14:val="standardContextual"/>
             </w:rPr>
           </w:pPr>
-          <w:hyperlink w:anchor="_Toc239352146" w:history="1">
+          <w:hyperlink w:anchor="_Toc239360075" w:history="1">
             <w:r>
               <w:rPr>
                 <w:rStyle w:val="Hyperlink"/>
@@ -2244,7 +2247,7 @@
                 <w:noProof/>
                 <w:webHidden/>
               </w:rPr>
-              <w:instrText xml:space="preserve"> PAGEREF _Toc239352146 \h </w:instrText>
+              <w:instrText xml:space="preserve"> PAGEREF _Toc239360075 \h </w:instrText>
             </w:r>
             <w:r>
               <w:rPr>
@@ -2288,7 +2291,7 @@
               <w14:ligatures w14:val="standardContextual"/>
             </w:rPr>
           </w:pPr>
-          <w:hyperlink w:anchor="_Toc239352147" w:history="1">
+          <w:hyperlink w:anchor="_Toc239360076" w:history="1">
             <w:r>
               <w:rPr>
                 <w:rStyle w:val="Hyperlink"/>
@@ -2316,7 +2319,7 @@
                 <w:noProof/>
                 <w:webHidden/>
               </w:rPr>
-              <w:instrText xml:space="preserve"> PAGEREF _Toc239352147 \h </w:instrText>
+              <w:instrText xml:space="preserve"> PAGEREF _Toc239360076 \h </w:instrText>
             </w:r>
             <w:r>
               <w:rPr>
@@ -2360,7 +2363,7 @@
               <w14:ligatures w14:val="standardContextual"/>
             </w:rPr>
           </w:pPr>
-          <w:hyperlink w:anchor="_Toc239352148" w:history="1">
+          <w:hyperlink w:anchor="_Toc239360077" w:history="1">
             <w:r>
               <w:rPr>
                 <w:rStyle w:val="Hyperlink"/>
@@ -2388,7 +2391,7 @@
                 <w:noProof/>
                 <w:webHidden/>
               </w:rPr>
-              <w:instrText xml:space="preserve"> PAGEREF _Toc239352148 \h </w:instrText>
+              <w:instrText xml:space="preserve"> PAGEREF _Toc239360077 \h </w:instrText>
             </w:r>
             <w:r>
               <w:rPr>
@@ -2432,7 +2435,7 @@
               <w14:ligatures w14:val="standardContextual"/>
             </w:rPr>
           </w:pPr>
-          <w:hyperlink w:anchor="_Toc239352149" w:history="1">
+          <w:hyperlink w:anchor="_Toc239360078" w:history="1">
             <w:r>
               <w:rPr>
                 <w:rStyle w:val="Hyperlink"/>
@@ -2460,7 +2463,7 @@
                 <w:noProof/>
                 <w:webHidden/>
               </w:rPr>
-              <w:instrText xml:space="preserve"> PAGEREF _Toc239352149 \h </w:instrText>
+              <w:instrText xml:space="preserve"> PAGEREF _Toc239360078 \h </w:instrText>
             </w:r>
             <w:r>
               <w:rPr>
@@ -2504,7 +2507,7 @@
               <w14:ligatures w14:val="standardContextual"/>
             </w:rPr>
           </w:pPr>
-          <w:hyperlink w:anchor="_Toc239352150" w:history="1">
+          <w:hyperlink w:anchor="_Toc239360079" w:history="1">
             <w:r>
               <w:rPr>
                 <w:rStyle w:val="Hyperlink"/>
@@ -2532,7 +2535,7 @@
                 <w:noProof/>
                 <w:webHidden/>
               </w:rPr>
-              <w:instrText xml:space="preserve"> PAGEREF _Toc239352150 \h </w:instrText>
+              <w:instrText xml:space="preserve"> PAGEREF _Toc239360079 \h </w:instrText>
             </w:r>
             <w:r>
               <w:rPr>
@@ -2576,7 +2579,7 @@
               <w14:ligatures w14:val="standardContextual"/>
             </w:rPr>
           </w:pPr>
-          <w:hyperlink w:anchor="_Toc239352151" w:history="1">
+          <w:hyperlink w:anchor="_Toc239360080" w:history="1">
             <w:r>
               <w:rPr>
                 <w:rStyle w:val="Hyperlink"/>
@@ -2604,7 +2607,7 @@
                 <w:noProof/>
                 <w:webHidden/>
               </w:rPr>
-              <w:instrText xml:space="preserve"> PAGEREF _Toc239352151 \h </w:instrText>
+              <w:instrText xml:space="preserve"> PAGEREF _Toc239360080 \h </w:instrText>
             </w:r>
             <w:r>
               <w:rPr>
@@ -2648,7 +2651,7 @@
               <w14:ligatures w14:val="standardContextual"/>
             </w:rPr>
           </w:pPr>
-          <w:hyperlink w:anchor="_Toc239352152" w:history="1">
+          <w:hyperlink w:anchor="_Toc239360081" w:history="1">
             <w:r>
               <w:rPr>
                 <w:rStyle w:val="Hyperlink"/>
@@ -2676,7 +2679,7 @@
                 <w:noProof/>
                 <w:webHidden/>
               </w:rPr>
-              <w:instrText xml:space="preserve"> PAGEREF _Toc239352152 \h </w:instrText>
+              <w:instrText xml:space="preserve"> PAGEREF _Toc239360081 \h </w:instrText>
             </w:r>
             <w:r>
               <w:rPr>
@@ -2720,7 +2723,7 @@
               <w14:ligatures w14:val="standardContextual"/>
             </w:rPr>
           </w:pPr>
-          <w:hyperlink w:anchor="_Toc239352153" w:history="1">
+          <w:hyperlink w:anchor="_Toc239360082" w:history="1">
             <w:r>
               <w:rPr>
                 <w:rStyle w:val="Hyperlink"/>
@@ -2748,7 +2751,7 @@
                 <w:noProof/>
                 <w:webHidden/>
               </w:rPr>
-              <w:instrText xml:space="preserve"> PAGEREF _Toc239352153 \h </w:instrText>
+              <w:instrText xml:space="preserve"> PAGEREF _Toc239360082 \h </w:instrText>
             </w:r>
             <w:r>
               <w:rPr>
@@ -2792,7 +2795,7 @@
               <w14:ligatures w14:val="standardContextual"/>
             </w:rPr>
           </w:pPr>
-          <w:hyperlink w:anchor="_Toc239352154" w:history="1">
+          <w:hyperlink w:anchor="_Toc239360083" w:history="1">
             <w:r>
               <w:rPr>
                 <w:rStyle w:val="Hyperlink"/>
@@ -2820,7 +2823,7 @@
                 <w:noProof/>
                 <w:webHidden/>
               </w:rPr>
-              <w:instrText xml:space="preserve"> PAGEREF _Toc239352154 \h </w:instrText>
+              <w:instrText xml:space="preserve"> PAGEREF _Toc239360083 \h </w:instrText>
             </w:r>
             <w:r>
               <w:rPr>
@@ -2864,7 +2867,7 @@
               <w14:ligatures w14:val="standardContextual"/>
             </w:rPr>
           </w:pPr>
-          <w:hyperlink w:anchor="_Toc239352155" w:history="1">
+          <w:hyperlink w:anchor="_Toc239360084" w:history="1">
             <w:r>
               <w:rPr>
                 <w:rStyle w:val="Hyperlink"/>
@@ -2892,7 +2895,7 @@
                 <w:noProof/>
                 <w:webHidden/>
               </w:rPr>
-              <w:instrText xml:space="preserve"> PAGEREF _Toc239352155 \h </w:instrText>
+              <w:instrText xml:space="preserve"> PAGEREF _Toc239360084 \h </w:instrText>
             </w:r>
             <w:r>
               <w:rPr>
@@ -2936,7 +2939,7 @@
               <w14:ligatures w14:val="standardContextual"/>
             </w:rPr>
           </w:pPr>
-          <w:hyperlink w:anchor="_Toc239352156" w:history="1">
+          <w:hyperlink w:anchor="_Toc239360085" w:history="1">
             <w:r>
               <w:rPr>
                 <w:rStyle w:val="Hyperlink"/>
@@ -2964,7 +2967,7 @@
                 <w:noProof/>
                 <w:webHidden/>
               </w:rPr>
-              <w:instrText xml:space="preserve"> PAGEREF _Toc239352156 \h </w:instrText>
+              <w:instrText xml:space="preserve"> PAGEREF _Toc239360085 \h </w:instrText>
             </w:r>
             <w:r>
               <w:rPr>
@@ -3008,7 +3011,7 @@
               <w14:ligatures w14:val="standardContextual"/>
             </w:rPr>
           </w:pPr>
-          <w:hyperlink w:anchor="_Toc239352157" w:history="1">
+          <w:hyperlink w:anchor="_Toc239360086" w:history="1">
             <w:r>
               <w:rPr>
                 <w:rStyle w:val="Hyperlink"/>
@@ -3036,7 +3039,7 @@
                 <w:noProof/>
                 <w:webHidden/>
               </w:rPr>
-              <w:instrText xml:space="preserve"> PAGEREF _Toc239352157 \h </w:instrText>
+              <w:instrText xml:space="preserve"> PAGEREF _Toc239360086 \h </w:instrText>
             </w:r>
             <w:r>
               <w:rPr>
@@ -3080,7 +3083,7 @@
               <w14:ligatures w14:val="standardContextual"/>
             </w:rPr>
           </w:pPr>
-          <w:hyperlink w:anchor="_Toc239352158" w:history="1">
+          <w:hyperlink w:anchor="_Toc239360087" w:history="1">
             <w:r>
               <w:rPr>
                 <w:rStyle w:val="Hyperlink"/>
@@ -3108,7 +3111,7 @@
                 <w:noProof/>
                 <w:webHidden/>
               </w:rPr>
-              <w:instrText xml:space="preserve"> PAGEREF _Toc239352158 \h </w:instrText>
+              <w:instrText xml:space="preserve"> PAGEREF _Toc239360087 \h </w:instrText>
             </w:r>
             <w:r>
               <w:rPr>
@@ -3152,7 +3155,7 @@
               <w14:ligatures w14:val="standardContextual"/>
             </w:rPr>
           </w:pPr>
-          <w:hyperlink w:anchor="_Toc239352159" w:history="1">
+          <w:hyperlink w:anchor="_Toc239360088" w:history="1">
             <w:r>
               <w:rPr>
                 <w:rStyle w:val="Hyperlink"/>
@@ -3180,7 +3183,7 @@
                 <w:noProof/>
                 <w:webHidden/>
               </w:rPr>
-              <w:instrText xml:space="preserve"> PAGEREF _Toc239352159 \h </w:instrText>
+              <w:instrText xml:space="preserve"> PAGEREF _Toc239360088 \h </w:instrText>
             </w:r>
             <w:r>
               <w:rPr>
@@ -3224,7 +3227,7 @@
               <w14:ligatures w14:val="standardContextual"/>
             </w:rPr>
           </w:pPr>
-          <w:hyperlink w:anchor="_Toc239352160" w:history="1">
+          <w:hyperlink w:anchor="_Toc239360089" w:history="1">
             <w:r>
               <w:rPr>
                 <w:rStyle w:val="Hyperlink"/>
@@ -3252,7 +3255,7 @@
                 <w:noProof/>
                 <w:webHidden/>
               </w:rPr>
-              <w:instrText xml:space="preserve"> PAGEREF _Toc239352160 \h </w:instrText>
+              <w:instrText xml:space="preserve"> PAGEREF _Toc239360089 \h </w:instrText>
             </w:r>
             <w:r>
               <w:rPr>
@@ -3296,7 +3299,7 @@
               <w14:ligatures w14:val="standardContextual"/>
             </w:rPr>
           </w:pPr>
-          <w:hyperlink w:anchor="_Toc239352161" w:history="1">
+          <w:hyperlink w:anchor="_Toc239360090" w:history="1">
             <w:r>
               <w:rPr>
                 <w:rStyle w:val="Hyperlink"/>
@@ -3324,7 +3327,7 @@
                 <w:noProof/>
                 <w:webHidden/>
               </w:rPr>
-              <w:instrText xml:space="preserve"> PAGEREF _Toc239352161 \h </w:instrText>
+              <w:instrText xml:space="preserve"> PAGEREF _Toc239360090 \h </w:instrText>
             </w:r>
             <w:r>
               <w:rPr>
@@ -3368,7 +3371,7 @@
               <w14:ligatures w14:val="standardContextual"/>
             </w:rPr>
           </w:pPr>
-          <w:hyperlink w:anchor="_Toc239352162" w:history="1">
+          <w:hyperlink w:anchor="_Toc239360091" w:history="1">
             <w:r>
               <w:rPr>
                 <w:rStyle w:val="Hyperlink"/>
@@ -3396,7 +3399,7 @@
                 <w:noProof/>
                 <w:webHidden/>
               </w:rPr>
-              <w:instrText xml:space="preserve"> PAGEREF _Toc239352162 \h </w:instrText>
+              <w:instrText xml:space="preserve"> PAGEREF _Toc239360091 \h </w:instrText>
             </w:r>
             <w:r>
               <w:rPr>
@@ -3440,7 +3443,7 @@
               <w14:ligatures w14:val="standardContextual"/>
             </w:rPr>
           </w:pPr>
-          <w:hyperlink w:anchor="_Toc239352163" w:history="1">
+          <w:hyperlink w:anchor="_Toc239360092" w:history="1">
             <w:r>
               <w:rPr>
                 <w:rStyle w:val="Hyperlink"/>
@@ -3468,7 +3471,7 @@
                 <w:noProof/>
                 <w:webHidden/>
               </w:rPr>
-              <w:instrText xml:space="preserve"> PAGEREF _Toc239352163 \h </w:instrText>
+              <w:instrText xml:space="preserve"> PAGEREF _Toc239360092 \h </w:instrText>
             </w:r>
             <w:r>
               <w:rPr>
@@ -3512,7 +3515,7 @@
               <w14:ligatures w14:val="standardContextual"/>
             </w:rPr>
           </w:pPr>
-          <w:hyperlink w:anchor="_Toc239352164" w:history="1">
+          <w:hyperlink w:anchor="_Toc239360093" w:history="1">
             <w:r>
               <w:rPr>
                 <w:rStyle w:val="Hyperlink"/>
@@ -3540,7 +3543,7 @@
                 <w:noProof/>
                 <w:webHidden/>
               </w:rPr>
-              <w:instrText xml:space="preserve"> PAGEREF _Toc239352164 \h </w:instrText>
+              <w:instrText xml:space="preserve"> PAGEREF _Toc239360093 \h </w:instrText>
             </w:r>
             <w:r>
               <w:rPr>
@@ -3584,7 +3587,7 @@
               <w14:ligatures w14:val="standardContextual"/>
             </w:rPr>
           </w:pPr>
-          <w:hyperlink w:anchor="_Toc239352165" w:history="1">
+          <w:hyperlink w:anchor="_Toc239360094" w:history="1">
             <w:r>
               <w:rPr>
                 <w:rStyle w:val="Hyperlink"/>
@@ -3612,7 +3615,7 @@
                 <w:noProof/>
                 <w:webHidden/>
               </w:rPr>
-              <w:instrText xml:space="preserve"> PAGEREF _Toc239352165 \h </w:instrText>
+              <w:instrText xml:space="preserve"> PAGEREF _Toc239360094 \h </w:instrText>
             </w:r>
             <w:r>
               <w:rPr>
@@ -3656,7 +3659,7 @@
               <w14:ligatures w14:val="standardContextual"/>
             </w:rPr>
           </w:pPr>
-          <w:hyperlink w:anchor="_Toc239352166" w:history="1">
+          <w:hyperlink w:anchor="_Toc239360095" w:history="1">
             <w:r>
               <w:rPr>
                 <w:rStyle w:val="Hyperlink"/>
@@ -3684,7 +3687,7 @@
                 <w:noProof/>
                 <w:webHidden/>
               </w:rPr>
-              <w:instrText xml:space="preserve"> PAGEREF _Toc239352166 \h </w:instrText>
+              <w:instrText xml:space="preserve"> PAGEREF _Toc239360095 \h </w:instrText>
             </w:r>
             <w:r>
               <w:rPr>
@@ -3728,7 +3731,7 @@
               <w14:ligatures w14:val="standardContextual"/>
             </w:rPr>
           </w:pPr>
-          <w:hyperlink w:anchor="_Toc239352167" w:history="1">
+          <w:hyperlink w:anchor="_Toc239360096" w:history="1">
             <w:r>
               <w:rPr>
                 <w:rStyle w:val="Hyperlink"/>
@@ -3756,7 +3759,7 @@
                 <w:noProof/>
                 <w:webHidden/>
               </w:rPr>
-              <w:instrText xml:space="preserve"> PAGEREF _Toc239352167 \h </w:instrText>
+              <w:instrText xml:space="preserve"> PAGEREF _Toc239360096 \h </w:instrText>
             </w:r>
             <w:r>
               <w:rPr>
@@ -3800,7 +3803,7 @@
               <w14:ligatures w14:val="standardContextual"/>
             </w:rPr>
           </w:pPr>
-          <w:hyperlink w:anchor="_Toc239352168" w:history="1">
+          <w:hyperlink w:anchor="_Toc239360097" w:history="1">
             <w:r>
               <w:rPr>
                 <w:rStyle w:val="Hyperlink"/>
@@ -3828,7 +3831,7 @@
                 <w:noProof/>
                 <w:webHidden/>
               </w:rPr>
-              <w:instrText xml:space="preserve"> PAGEREF _Toc239352168 \h </w:instrText>
+              <w:instrText xml:space="preserve"> PAGEREF _Toc239360097 \h </w:instrText>
             </w:r>
             <w:r>
               <w:rPr>
@@ -3872,7 +3875,7 @@
               <w14:ligatures w14:val="standardContextual"/>
             </w:rPr>
           </w:pPr>
-          <w:hyperlink w:anchor="_Toc239352169" w:history="1">
+          <w:hyperlink w:anchor="_Toc239360098" w:history="1">
             <w:r>
               <w:rPr>
                 <w:rStyle w:val="Hyperlink"/>
@@ -3900,7 +3903,7 @@
                 <w:noProof/>
                 <w:webHidden/>
               </w:rPr>
-              <w:instrText xml:space="preserve"> PAGEREF _Toc239352169 \h </w:instrText>
+              <w:instrText xml:space="preserve"> PAGEREF _Toc239360098 \h </w:instrText>
             </w:r>
             <w:r>
               <w:rPr>
@@ -3944,7 +3947,7 @@
               <w14:ligatures w14:val="standardContextual"/>
             </w:rPr>
           </w:pPr>
-          <w:hyperlink w:anchor="_Toc239352170" w:history="1">
+          <w:hyperlink w:anchor="_Toc239360099" w:history="1">
             <w:r>
               <w:rPr>
                 <w:rStyle w:val="Hyperlink"/>
@@ -3972,7 +3975,7 @@
                 <w:noProof/>
                 <w:webHidden/>
               </w:rPr>
-              <w:instrText xml:space="preserve"> PAGEREF _Toc239352170 \h </w:instrText>
+              <w:instrText xml:space="preserve"> PAGEREF _Toc239360099 \h </w:instrText>
             </w:r>
             <w:r>
               <w:rPr>
@@ -4016,7 +4019,7 @@
               <w14:ligatures w14:val="standardContextual"/>
             </w:rPr>
           </w:pPr>
-          <w:hyperlink w:anchor="_Toc239352171" w:history="1">
+          <w:hyperlink w:anchor="_Toc239360100" w:history="1">
             <w:r>
               <w:rPr>
                 <w:rStyle w:val="Hyperlink"/>
@@ -4044,7 +4047,7 @@
                 <w:noProof/>
                 <w:webHidden/>
               </w:rPr>
-              <w:instrText xml:space="preserve"> PAGEREF _Toc239352171 \h </w:instrText>
+              <w:instrText xml:space="preserve"> PAGEREF _Toc239360100 \h </w:instrText>
             </w:r>
             <w:r>
               <w:rPr>
@@ -4088,7 +4091,7 @@
               <w14:ligatures w14:val="standardContextual"/>
             </w:rPr>
           </w:pPr>
-          <w:hyperlink w:anchor="_Toc239352172" w:history="1">
+          <w:hyperlink w:anchor="_Toc239360101" w:history="1">
             <w:r>
               <w:rPr>
                 <w:rStyle w:val="Hyperlink"/>
@@ -4116,7 +4119,7 @@
                 <w:noProof/>
                 <w:webHidden/>
               </w:rPr>
-              <w:instrText xml:space="preserve"> PAGEREF _Toc239352172 \h </w:instrText>
+              <w:instrText xml:space="preserve"> PAGEREF _Toc239360101 \h </w:instrText>
             </w:r>
             <w:r>
               <w:rPr>
@@ -4160,7 +4163,7 @@
               <w14:ligatures w14:val="standardContextual"/>
             </w:rPr>
           </w:pPr>
-          <w:hyperlink w:anchor="_Toc239352173" w:history="1">
+          <w:hyperlink w:anchor="_Toc239360102" w:history="1">
             <w:r>
               <w:rPr>
                 <w:rStyle w:val="Hyperlink"/>
@@ -4188,7 +4191,7 @@
                 <w:noProof/>
                 <w:webHidden/>
               </w:rPr>
-              <w:instrText xml:space="preserve"> PAGEREF _Toc239352173 \h </w:instrText>
+              <w:instrText xml:space="preserve"> PAGEREF _Toc239360102 \h </w:instrText>
             </w:r>
             <w:r>
               <w:rPr>
@@ -4232,7 +4235,7 @@
               <w14:ligatures w14:val="standardContextual"/>
             </w:rPr>
           </w:pPr>
-          <w:hyperlink w:anchor="_Toc239352174" w:history="1">
+          <w:hyperlink w:anchor="_Toc239360103" w:history="1">
             <w:r>
               <w:rPr>
                 <w:rStyle w:val="Hyperlink"/>
@@ -4260,7 +4263,7 @@
                 <w:noProof/>
                 <w:webHidden/>
               </w:rPr>
-              <w:instrText xml:space="preserve"> PAGEREF _Toc239352174 \h </w:instrText>
+              <w:instrText xml:space="preserve"> PAGEREF _Toc239360103 \h </w:instrText>
             </w:r>
             <w:r>
               <w:rPr>
@@ -4304,7 +4307,7 @@
               <w14:ligatures w14:val="standardContextual"/>
             </w:rPr>
           </w:pPr>
-          <w:hyperlink w:anchor="_Toc239352175" w:history="1">
+          <w:hyperlink w:anchor="_Toc239360104" w:history="1">
             <w:r>
               <w:rPr>
                 <w:rStyle w:val="Hyperlink"/>
@@ -4332,7 +4335,7 @@
                 <w:noProof/>
                 <w:webHidden/>
               </w:rPr>
-              <w:instrText xml:space="preserve"> PAGEREF _Toc239352175 \h </w:instrText>
+              <w:instrText xml:space="preserve"> PAGEREF _Toc239360104 \h </w:instrText>
             </w:r>
             <w:r>
               <w:rPr>
@@ -4376,7 +4379,7 @@
               <w14:ligatures w14:val="standardContextual"/>
             </w:rPr>
           </w:pPr>
-          <w:hyperlink w:anchor="_Toc239352176" w:history="1">
+          <w:hyperlink w:anchor="_Toc239360105" w:history="1">
             <w:r>
               <w:rPr>
                 <w:rStyle w:val="Hyperlink"/>
@@ -4404,7 +4407,7 @@
                 <w:noProof/>
                 <w:webHidden/>
               </w:rPr>
-              <w:instrText xml:space="preserve"> PAGEREF _Toc239352176 \h </w:instrText>
+              <w:instrText xml:space="preserve"> PAGEREF _Toc239360105 \h </w:instrText>
             </w:r>
             <w:r>
               <w:rPr>
@@ -4448,7 +4451,7 @@
               <w14:ligatures w14:val="standardContextual"/>
             </w:rPr>
           </w:pPr>
-          <w:hyperlink w:anchor="_Toc239352177" w:history="1">
+          <w:hyperlink w:anchor="_Toc239360106" w:history="1">
             <w:r>
               <w:rPr>
                 <w:rStyle w:val="Hyperlink"/>
@@ -4476,7 +4479,7 @@
                 <w:noProof/>
                 <w:webHidden/>
               </w:rPr>
-              <w:instrText xml:space="preserve"> PAGEREF _Toc239352177 \h </w:instrText>
+              <w:instrText xml:space="preserve"> PAGEREF _Toc239360106 \h </w:instrText>
             </w:r>
             <w:r>
               <w:rPr>
@@ -4520,7 +4523,7 @@
               <w14:ligatures w14:val="standardContextual"/>
             </w:rPr>
           </w:pPr>
-          <w:hyperlink w:anchor="_Toc239352178" w:history="1">
+          <w:hyperlink w:anchor="_Toc239360107" w:history="1">
             <w:r>
               <w:rPr>
                 <w:rStyle w:val="Hyperlink"/>
@@ -4548,7 +4551,7 @@
                 <w:noProof/>
                 <w:webHidden/>
               </w:rPr>
-              <w:instrText xml:space="preserve"> PAGEREF _Toc239352178 \h </w:instrText>
+              <w:instrText xml:space="preserve"> PAGEREF _Toc239360107 \h </w:instrText>
             </w:r>
             <w:r>
               <w:rPr>
@@ -4592,7 +4595,7 @@
               <w14:ligatures w14:val="standardContextual"/>
             </w:rPr>
           </w:pPr>
-          <w:hyperlink w:anchor="_Toc239352179" w:history="1">
+          <w:hyperlink w:anchor="_Toc239360108" w:history="1">
             <w:r>
               <w:rPr>
                 <w:rStyle w:val="Hyperlink"/>
@@ -4620,7 +4623,7 @@
                 <w:noProof/>
                 <w:webHidden/>
               </w:rPr>
-              <w:instrText xml:space="preserve"> PAGEREF _Toc239352179 \h </w:instrText>
+              <w:instrText xml:space="preserve"> PAGEREF _Toc239360108 \h </w:instrText>
             </w:r>
             <w:r>
               <w:rPr>
@@ -4691,7 +4694,7 @@
           <w:color w:val="auto"/>
         </w:rPr>
       </w:pPr>
-      <w:bookmarkStart w:id="0" w:name="_Toc239352121"/>
+      <w:bookmarkStart w:id="0" w:name="_Toc239360050"/>
       <w:r>
         <w:rPr>
           <w:rFonts w:ascii="Bierstadt Display" w:hAnsi="Bierstadt Display"/>
@@ -4981,7 +4984,7 @@
           <w:color w:val="auto"/>
         </w:rPr>
       </w:pPr>
-      <w:bookmarkStart w:id="1" w:name="_Toc239352122"/>
+      <w:bookmarkStart w:id="1" w:name="_Toc239360051"/>
       <w:r>
         <w:rPr>
           <w:rFonts w:ascii="Bierstadt Display" w:hAnsi="Bierstadt Display"/>
@@ -5392,7 +5395,21 @@
           <w:rFonts w:ascii="Bierstadt Display" w:eastAsia="Calibri" w:hAnsi="Bierstadt Display"/>
           <w:b/>
         </w:rPr>
-        <w:t xml:space="preserve">Why this brief, why now. The same pressure that shows in Figures 1-2 also makes goodwill easy to misallocate: intention without a completed gift, and gifts that follow networks rather than measured risk or need type. </w:t>
+        <w:t xml:space="preserve">Why this brief, why now. </w:t>
+      </w:r>
+      <w:r>
+        <w:rPr>
+          <w:rFonts w:ascii="Bierstadt Display" w:eastAsia="Calibri" w:hAnsi="Bierstadt Display"/>
+          <w:bCs/>
+        </w:rPr>
+        <w:t>The same pressure that shows in Figures 1-2 also makes goodwill easy to misallocate: intention without a completed gift, and gifts that follow networks rather than measured risk or need type.</w:t>
+      </w:r>
+      <w:r>
+        <w:rPr>
+          <w:rFonts w:ascii="Bierstadt Display" w:eastAsia="Calibri" w:hAnsi="Bierstadt Display"/>
+          <w:b/>
+        </w:rPr>
+        <w:t xml:space="preserve"> </w:t>
       </w:r>
     </w:p>
     <w:p>
@@ -5401,25 +5418,33 @@
         <w:jc w:val="both"/>
         <w:rPr>
           <w:rFonts w:ascii="Bierstadt Display" w:eastAsia="Calibri" w:hAnsi="Bierstadt Display"/>
-        </w:rPr>
-      </w:pPr>
-      <w:r>
-        <w:rPr>
-          <w:rFonts w:ascii="Bierstadt Display" w:eastAsia="Calibri" w:hAnsi="Bierstadt Display"/>
-          <w:b/>
-        </w:rPr>
-        <w:t>The chapters that follow cover the venture response (company, team, strategy, pilot gates, evidence, architecture, and a Year-1 ask) without restating the full MVP catalogue from Section 1. Live demos: https://jesyldah.github.io/ElimuMatch/.</w:t>
+          <w:bCs/>
+        </w:rPr>
+      </w:pPr>
+      <w:r>
+        <w:rPr>
+          <w:rFonts w:ascii="Bierstadt Display" w:eastAsia="Calibri" w:hAnsi="Bierstadt Display"/>
+          <w:bCs/>
+        </w:rPr>
+        <w:t xml:space="preserve">The chapters that follow cover the venture response (company, team, strategy, pilot gates, evidence, architecture, and a Year-1 ask) without restating the full MVP catalogue from Section 1. Live demos: </w:t>
       </w:r>
       <w:hyperlink r:id="rId11" w:history="1">
         <w:r>
           <w:rPr>
             <w:rStyle w:val="Hyperlink"/>
             <w:rFonts w:ascii="Bierstadt Display" w:eastAsia="Calibri" w:hAnsi="Bierstadt Display"/>
-            <w:color w:val="auto"/>
+            <w:bCs/>
           </w:rPr>
           <w:t>https://jesyldah.github.io/ElimuMatch/</w:t>
         </w:r>
       </w:hyperlink>
+      <w:r>
+        <w:rPr>
+          <w:rFonts w:ascii="Bierstadt Display" w:eastAsia="Calibri" w:hAnsi="Bierstadt Display"/>
+          <w:bCs/>
+        </w:rPr>
+        <w:t xml:space="preserve"> .</w:t>
+      </w:r>
     </w:p>
     <w:p>
       <w:pPr>
@@ -5447,7 +5472,7 @@
           <w:color w:val="auto"/>
         </w:rPr>
       </w:pPr>
-      <w:bookmarkStart w:id="2" w:name="_Toc239352123"/>
+      <w:bookmarkStart w:id="2" w:name="_Toc239360052"/>
       <w:r>
         <w:rPr>
           <w:rFonts w:ascii="Bierstadt Display" w:hAnsi="Bierstadt Display"/>
@@ -5634,7 +5659,7 @@
         <w:rPr>
           <w:rFonts w:ascii="Bierstadt Display" w:eastAsia="Calibri" w:hAnsi="Bierstadt Display"/>
         </w:rPr>
-        <w:t xml:space="preserve"> From place to gift in four steps: the lunch-break path capital would pilot.</w:t>
+        <w:t xml:space="preserve"> From place to gift in four steps.</w:t>
       </w:r>
     </w:p>
     <w:p>
@@ -5727,13 +5752,27 @@
           <w:color w:val="auto"/>
         </w:rPr>
       </w:pPr>
-      <w:bookmarkStart w:id="3" w:name="_Toc239352124"/>
+      <w:bookmarkStart w:id="3" w:name="_Toc239360053"/>
       <w:r>
         <w:rPr>
           <w:rFonts w:ascii="Bierstadt Display" w:hAnsi="Bierstadt Display"/>
           <w:color w:val="auto"/>
         </w:rPr>
-        <w:t>4. Team</w:t>
+        <w:t xml:space="preserve">4. </w:t>
+      </w:r>
+      <w:r>
+        <w:rPr>
+          <w:rFonts w:ascii="Bierstadt Display" w:hAnsi="Bierstadt Display"/>
+          <w:color w:val="auto"/>
+        </w:rPr>
+        <w:t xml:space="preserve">ElimuMatch </w:t>
+      </w:r>
+      <w:r>
+        <w:rPr>
+          <w:rFonts w:ascii="Bierstadt Display" w:hAnsi="Bierstadt Display"/>
+          <w:color w:val="auto"/>
+        </w:rPr>
+        <w:t>Team</w:t>
       </w:r>
       <w:bookmarkEnd w:id="3"/>
     </w:p>
@@ -5745,7 +5784,7 @@
           <w:color w:val="auto"/>
         </w:rPr>
       </w:pPr>
-      <w:bookmarkStart w:id="4" w:name="_Toc239352125"/>
+      <w:bookmarkStart w:id="4" w:name="_Toc239360054"/>
       <w:r>
         <w:rPr>
           <w:rFonts w:ascii="Bierstadt Display" w:hAnsi="Bierstadt Display"/>
@@ -5807,7 +5846,7 @@
           <w:color w:val="auto"/>
         </w:rPr>
       </w:pPr>
-      <w:bookmarkStart w:id="5" w:name="_Toc239352126"/>
+      <w:bookmarkStart w:id="5" w:name="_Toc239360055"/>
       <w:r>
         <w:rPr>
           <w:rFonts w:ascii="Bierstadt Display" w:hAnsi="Bierstadt Display"/>
@@ -6039,7 +6078,7 @@
           <w:color w:val="auto"/>
         </w:rPr>
       </w:pPr>
-      <w:bookmarkStart w:id="6" w:name="_Toc239352127"/>
+      <w:bookmarkStart w:id="6" w:name="_Toc239360056"/>
       <w:r>
         <w:rPr>
           <w:rFonts w:ascii="Bierstadt Display" w:hAnsi="Bierstadt Display"/>
@@ -6741,7 +6780,7 @@
           <w:color w:val="auto"/>
         </w:rPr>
       </w:pPr>
-      <w:bookmarkStart w:id="7" w:name="_Toc239352128"/>
+      <w:bookmarkStart w:id="7" w:name="_Toc239360057"/>
       <w:r>
         <w:rPr>
           <w:rFonts w:ascii="Bierstadt Display" w:hAnsi="Bierstadt Display"/>
@@ -6789,7 +6828,7 @@
           <w:color w:val="auto"/>
         </w:rPr>
       </w:pPr>
-      <w:bookmarkStart w:id="8" w:name="_Toc239352129"/>
+      <w:bookmarkStart w:id="8" w:name="_Toc239360058"/>
       <w:r>
         <w:rPr>
           <w:rFonts w:ascii="Bierstadt Display" w:hAnsi="Bierstadt Display"/>
@@ -6823,7 +6862,7 @@
           <w:color w:val="auto"/>
         </w:rPr>
       </w:pPr>
-      <w:bookmarkStart w:id="9" w:name="_Toc239352130"/>
+      <w:bookmarkStart w:id="9" w:name="_Toc239360059"/>
       <w:r>
         <w:rPr>
           <w:rFonts w:ascii="Bierstadt Display" w:hAnsi="Bierstadt Display"/>
@@ -6904,7 +6943,7 @@
           <w:color w:val="auto"/>
         </w:rPr>
       </w:pPr>
-      <w:bookmarkStart w:id="10" w:name="_Toc239352131"/>
+      <w:bookmarkStart w:id="10" w:name="_Toc239360060"/>
       <w:r>
         <w:rPr>
           <w:rFonts w:ascii="Bierstadt Display" w:hAnsi="Bierstadt Display"/>
@@ -7125,7 +7164,7 @@
           <w:color w:val="auto"/>
         </w:rPr>
       </w:pPr>
-      <w:bookmarkStart w:id="11" w:name="_Toc239352132"/>
+      <w:bookmarkStart w:id="11" w:name="_Toc239360061"/>
       <w:r>
         <w:rPr>
           <w:rFonts w:ascii="Bierstadt Display" w:hAnsi="Bierstadt Display"/>
@@ -7311,7 +7350,7 @@
           <w:color w:val="auto"/>
         </w:rPr>
       </w:pPr>
-      <w:bookmarkStart w:id="12" w:name="_Toc239352133"/>
+      <w:bookmarkStart w:id="12" w:name="_Toc239360062"/>
       <w:r>
         <w:rPr>
           <w:rFonts w:ascii="Bierstadt Display" w:hAnsi="Bierstadt Display"/>
@@ -7373,7 +7412,7 @@
           <w:color w:val="auto"/>
         </w:rPr>
       </w:pPr>
-      <w:bookmarkStart w:id="13" w:name="_Toc239352134"/>
+      <w:bookmarkStart w:id="13" w:name="_Toc239360063"/>
       <w:r>
         <w:rPr>
           <w:rFonts w:ascii="Bierstadt Display" w:hAnsi="Bierstadt Display"/>
@@ -7419,7 +7458,7 @@
           <w:color w:val="auto"/>
         </w:rPr>
       </w:pPr>
-      <w:bookmarkStart w:id="14" w:name="_Toc239352135"/>
+      <w:bookmarkStart w:id="14" w:name="_Toc239360064"/>
       <w:r>
         <w:rPr>
           <w:rFonts w:ascii="Bierstadt Display" w:hAnsi="Bierstadt Display"/>
@@ -8519,7 +8558,7 @@
           <w:color w:val="auto"/>
         </w:rPr>
       </w:pPr>
-      <w:bookmarkStart w:id="15" w:name="_Toc239352136"/>
+      <w:bookmarkStart w:id="15" w:name="_Toc239360065"/>
       <w:r>
         <w:rPr>
           <w:rFonts w:ascii="Bierstadt Display" w:hAnsi="Bierstadt Display"/>
@@ -9319,7 +9358,23 @@
                 <w:rFonts w:ascii="Bierstadt Display" w:eastAsia="Calibri" w:hAnsi="Bierstadt Display"/>
                 <w:sz w:val="18"/>
               </w:rPr>
-              <w:t>No overpay, no stale pay, oldest-term-first, ledger authority over screen cache</w:t>
+              <w:t xml:space="preserve">No overpay, no stale </w:t>
+            </w:r>
+            <w:proofErr w:type="gramStart"/>
+            <w:r>
+              <w:rPr>
+                <w:rFonts w:ascii="Bierstadt Display" w:eastAsia="Calibri" w:hAnsi="Bierstadt Display"/>
+                <w:sz w:val="18"/>
+              </w:rPr>
+              <w:t>pay</w:t>
+            </w:r>
+            <w:proofErr w:type="gramEnd"/>
+            <w:r>
+              <w:rPr>
+                <w:rFonts w:ascii="Bierstadt Display" w:eastAsia="Calibri" w:hAnsi="Bierstadt Display"/>
+                <w:sz w:val="18"/>
+              </w:rPr>
+              <w:t>, oldest-term-first, ledger authority over screen cache</w:t>
             </w:r>
           </w:p>
         </w:tc>
@@ -9355,7 +9410,7 @@
           <w:color w:val="auto"/>
         </w:rPr>
       </w:pPr>
-      <w:bookmarkStart w:id="16" w:name="_Toc239352137"/>
+      <w:bookmarkStart w:id="16" w:name="_Toc239360066"/>
       <w:r>
         <w:rPr>
           <w:rFonts w:ascii="Bierstadt Display" w:hAnsi="Bierstadt Display"/>
@@ -9445,7 +9500,7 @@
           <w:color w:val="auto"/>
         </w:rPr>
       </w:pPr>
-      <w:bookmarkStart w:id="17" w:name="_Toc239352138"/>
+      <w:bookmarkStart w:id="17" w:name="_Toc239360067"/>
       <w:r>
         <w:rPr>
           <w:rFonts w:ascii="Bierstadt Display" w:hAnsi="Bierstadt Display"/>
@@ -10902,7 +10957,7 @@
           <w:color w:val="auto"/>
         </w:rPr>
       </w:pPr>
-      <w:bookmarkStart w:id="18" w:name="_Toc239352139"/>
+      <w:bookmarkStart w:id="18" w:name="_Toc239360068"/>
       <w:r>
         <w:rPr>
           <w:rFonts w:ascii="Bierstadt Display" w:hAnsi="Bierstadt Display"/>
@@ -10920,7 +10975,7 @@
           <w:color w:val="auto"/>
         </w:rPr>
       </w:pPr>
-      <w:bookmarkStart w:id="19" w:name="_Toc239352140"/>
+      <w:bookmarkStart w:id="19" w:name="_Toc239360069"/>
       <w:r>
         <w:rPr>
           <w:rFonts w:ascii="Bierstadt Display" w:hAnsi="Bierstadt Display"/>
@@ -10973,7 +11028,7 @@
           <w:color w:val="auto"/>
         </w:rPr>
       </w:pPr>
-      <w:bookmarkStart w:id="20" w:name="_Toc239352141"/>
+      <w:bookmarkStart w:id="20" w:name="_Toc239360070"/>
       <w:r>
         <w:rPr>
           <w:rFonts w:ascii="Bierstadt Display" w:hAnsi="Bierstadt Display"/>
@@ -11013,7 +11068,7 @@
           <w:color w:val="auto"/>
         </w:rPr>
       </w:pPr>
-      <w:bookmarkStart w:id="21" w:name="_Toc239352142"/>
+      <w:bookmarkStart w:id="21" w:name="_Toc239360071"/>
       <w:r>
         <w:rPr>
           <w:rFonts w:ascii="Bierstadt Display" w:hAnsi="Bierstadt Display"/>
@@ -12094,7 +12149,7 @@
           <w:color w:val="auto"/>
         </w:rPr>
       </w:pPr>
-      <w:bookmarkStart w:id="22" w:name="_Toc239352143"/>
+      <w:bookmarkStart w:id="22" w:name="_Toc239360072"/>
       <w:r>
         <w:rPr>
           <w:rFonts w:ascii="Bierstadt Display" w:hAnsi="Bierstadt Display"/>
@@ -12127,7 +12182,7 @@
           <w:color w:val="auto"/>
         </w:rPr>
       </w:pPr>
-      <w:bookmarkStart w:id="23" w:name="_Toc239352144"/>
+      <w:bookmarkStart w:id="23" w:name="_Toc239360073"/>
       <w:r>
         <w:rPr>
           <w:rFonts w:ascii="Bierstadt Display" w:hAnsi="Bierstadt Display"/>
@@ -12692,7 +12747,7 @@
           <w:color w:val="auto"/>
         </w:rPr>
       </w:pPr>
-      <w:bookmarkStart w:id="24" w:name="_Toc239352145"/>
+      <w:bookmarkStart w:id="24" w:name="_Toc239360074"/>
       <w:r>
         <w:rPr>
           <w:rFonts w:ascii="Bierstadt Display" w:hAnsi="Bierstadt Display"/>
@@ -12827,7 +12882,7 @@
           <w:color w:val="auto"/>
         </w:rPr>
       </w:pPr>
-      <w:bookmarkStart w:id="25" w:name="_Toc239352146"/>
+      <w:bookmarkStart w:id="25" w:name="_Toc239360075"/>
       <w:r>
         <w:rPr>
           <w:rFonts w:ascii="Bierstadt Display" w:hAnsi="Bierstadt Display"/>
@@ -14307,7 +14362,7 @@
           <w:color w:val="auto"/>
         </w:rPr>
       </w:pPr>
-      <w:bookmarkStart w:id="26" w:name="_Toc239352147"/>
+      <w:bookmarkStart w:id="26" w:name="_Toc239360076"/>
       <w:r>
         <w:rPr>
           <w:rFonts w:ascii="Bierstadt Display" w:hAnsi="Bierstadt Display"/>
@@ -14347,7 +14402,7 @@
           <w:color w:val="auto"/>
         </w:rPr>
       </w:pPr>
-      <w:bookmarkStart w:id="27" w:name="_Toc239352148"/>
+      <w:bookmarkStart w:id="27" w:name="_Toc239360077"/>
       <w:r>
         <w:rPr>
           <w:rFonts w:ascii="Bierstadt Display" w:hAnsi="Bierstadt Display"/>
@@ -14512,7 +14567,7 @@
           <w:color w:val="auto"/>
         </w:rPr>
       </w:pPr>
-      <w:bookmarkStart w:id="28" w:name="_Toc239352149"/>
+      <w:bookmarkStart w:id="28" w:name="_Toc239360078"/>
       <w:r>
         <w:rPr>
           <w:rFonts w:ascii="Bierstadt Display" w:hAnsi="Bierstadt Display"/>
@@ -15016,7 +15071,7 @@
           <w:color w:val="auto"/>
         </w:rPr>
       </w:pPr>
-      <w:bookmarkStart w:id="29" w:name="_Toc239352150"/>
+      <w:bookmarkStart w:id="29" w:name="_Toc239360079"/>
       <w:r>
         <w:rPr>
           <w:rFonts w:ascii="Bierstadt Display" w:hAnsi="Bierstadt Display"/>
@@ -15049,7 +15104,7 @@
           <w:color w:val="auto"/>
         </w:rPr>
       </w:pPr>
-      <w:bookmarkStart w:id="30" w:name="_Toc239352151"/>
+      <w:bookmarkStart w:id="30" w:name="_Toc239360080"/>
       <w:r>
         <w:rPr>
           <w:rFonts w:ascii="Bierstadt Display" w:hAnsi="Bierstadt Display"/>
@@ -15089,7 +15144,7 @@
           <w:color w:val="auto"/>
         </w:rPr>
       </w:pPr>
-      <w:bookmarkStart w:id="31" w:name="_Toc239352152"/>
+      <w:bookmarkStart w:id="31" w:name="_Toc239360081"/>
       <w:r>
         <w:rPr>
           <w:rFonts w:ascii="Bierstadt Display" w:hAnsi="Bierstadt Display"/>
@@ -15851,7 +15906,7 @@
           <w:color w:val="auto"/>
         </w:rPr>
       </w:pPr>
-      <w:bookmarkStart w:id="32" w:name="_Toc239352153"/>
+      <w:bookmarkStart w:id="32" w:name="_Toc239360082"/>
       <w:r>
         <w:rPr>
           <w:rFonts w:ascii="Bierstadt Display" w:hAnsi="Bierstadt Display"/>
@@ -16339,7 +16394,7 @@
           <w:color w:val="auto"/>
         </w:rPr>
       </w:pPr>
-      <w:bookmarkStart w:id="33" w:name="_Toc239352154"/>
+      <w:bookmarkStart w:id="33" w:name="_Toc239360083"/>
       <w:r>
         <w:rPr>
           <w:rFonts w:ascii="Bierstadt Display" w:hAnsi="Bierstadt Display"/>
@@ -17833,7 +17888,7 @@
           <w:color w:val="auto"/>
         </w:rPr>
       </w:pPr>
-      <w:bookmarkStart w:id="34" w:name="_Toc239352155"/>
+      <w:bookmarkStart w:id="34" w:name="_Toc239360084"/>
       <w:r>
         <w:rPr>
           <w:rFonts w:ascii="Bierstadt Display" w:hAnsi="Bierstadt Display"/>
@@ -17871,7 +17926,21 @@
         <w:rPr>
           <w:rFonts w:ascii="Bierstadt Display" w:eastAsia="Calibri" w:hAnsi="Bierstadt Display"/>
         </w:rPr>
-        <w:t>A calibrated synthetic student record (later, a Tier-1 school extract) enters feature engineering and scoring. The model and personas feed an intervention matrix. Non-fee recommendations surface for school and partner attention. Fee-priority students appear on the Helper portal that filters by county and school type, including both Day and Boarding schools in every county. The helper chooses a student, selects term arrears, enters an amount, and pays. In a live local demo the ledger reallocates immediately; on GitHub Pages the gift is a personal offline demonstration so partners can review the flow without sharing a cloud database. The ElimuMatch Support Hub monitors KPIs, pilot success panels, concentration, rejections, and freshness. Analytics presents the basis for the routing. The same loop in Figure 5 (score, explain, assign, publish fee priority, settle, and monitor) is therefore product architecture, not a separate concept diagram.</w:t>
+        <w:t xml:space="preserve">A calibrated synthetic student record (later, a Tier-1 school extract) enters feature engineering and scoring. The model and personas feed an intervention matrix. Non-fee recommendations surface for school and partner attention. Fee-priority students appear on the Helper portal that filters by county and school type, including both Day and Boarding schools in every county. The helper chooses a student, selects term arrears, enters an amount, and pays. In a live local </w:t>
+      </w:r>
+      <w:proofErr w:type="gramStart"/>
+      <w:r>
+        <w:rPr>
+          <w:rFonts w:ascii="Bierstadt Display" w:eastAsia="Calibri" w:hAnsi="Bierstadt Display"/>
+        </w:rPr>
+        <w:t>demo</w:t>
+      </w:r>
+      <w:proofErr w:type="gramEnd"/>
+      <w:r>
+        <w:rPr>
+          <w:rFonts w:ascii="Bierstadt Display" w:eastAsia="Calibri" w:hAnsi="Bierstadt Display"/>
+        </w:rPr>
+        <w:t xml:space="preserve"> the ledger reallocates immediately; on GitHub Pages the gift is a personal offline demonstration so partners can review the flow without sharing a cloud database. The ElimuMatch Support Hub monitors KPIs, pilot success panels, concentration, rejections, and freshness. Analytics presents the basis for the routing. The same loop in Figure 5 (score, explain, assign, publish fee priority, settle, and monitor) is therefore product architecture, not a separate concept diagram.</w:t>
       </w:r>
     </w:p>
     <w:p>
@@ -18015,7 +18084,7 @@
           <w:color w:val="auto"/>
         </w:rPr>
       </w:pPr>
-      <w:bookmarkStart w:id="35" w:name="_Toc239352156"/>
+      <w:bookmarkStart w:id="35" w:name="_Toc239360085"/>
       <w:r>
         <w:rPr>
           <w:rFonts w:ascii="Bierstadt Display" w:hAnsi="Bierstadt Display"/>
@@ -18120,7 +18189,7 @@
           <w:color w:val="auto"/>
         </w:rPr>
       </w:pPr>
-      <w:bookmarkStart w:id="36" w:name="_Toc239352157"/>
+      <w:bookmarkStart w:id="36" w:name="_Toc239360086"/>
       <w:r>
         <w:rPr>
           <w:rFonts w:ascii="Bierstadt Display" w:hAnsi="Bierstadt Display"/>
@@ -18675,7 +18744,7 @@
           <w:color w:val="auto"/>
         </w:rPr>
       </w:pPr>
-      <w:bookmarkStart w:id="37" w:name="_Toc239352158"/>
+      <w:bookmarkStart w:id="37" w:name="_Toc239360087"/>
       <w:r>
         <w:rPr>
           <w:rFonts w:ascii="Bierstadt Display" w:hAnsi="Bierstadt Display"/>
@@ -19634,7 +19703,7 @@
           <w:color w:val="auto"/>
         </w:rPr>
       </w:pPr>
-      <w:bookmarkStart w:id="38" w:name="_Toc239352159"/>
+      <w:bookmarkStart w:id="38" w:name="_Toc239360088"/>
       <w:r>
         <w:rPr>
           <w:rFonts w:ascii="Bierstadt Display" w:hAnsi="Bierstadt Display"/>
@@ -20627,7 +20696,7 @@
           <w:color w:val="auto"/>
         </w:rPr>
       </w:pPr>
-      <w:bookmarkStart w:id="39" w:name="_Toc239352160"/>
+      <w:bookmarkStart w:id="39" w:name="_Toc239360089"/>
       <w:r>
         <w:rPr>
           <w:rFonts w:ascii="Bierstadt Display" w:hAnsi="Bierstadt Display"/>
@@ -21436,7 +21505,7 @@
           <w:color w:val="auto"/>
         </w:rPr>
       </w:pPr>
-      <w:bookmarkStart w:id="40" w:name="_Toc239352161"/>
+      <w:bookmarkStart w:id="40" w:name="_Toc239360090"/>
       <w:r>
         <w:rPr>
           <w:rFonts w:ascii="Bierstadt Display" w:hAnsi="Bierstadt Display"/>
@@ -22006,8 +22075,17 @@
                 <w:rFonts w:ascii="Bierstadt Display" w:eastAsia="Calibri" w:hAnsi="Bierstadt Display"/>
                 <w:sz w:val="18"/>
               </w:rPr>
-              <w:t>Retrain on partner data; soft pilot before publish</w:t>
-            </w:r>
+              <w:t xml:space="preserve">Retrain on partner data; soft pilot before </w:t>
+            </w:r>
+            <w:proofErr w:type="gramStart"/>
+            <w:r>
+              <w:rPr>
+                <w:rFonts w:ascii="Bierstadt Display" w:eastAsia="Calibri" w:hAnsi="Bierstadt Display"/>
+                <w:sz w:val="18"/>
+              </w:rPr>
+              <w:t>publish</w:t>
+            </w:r>
+            <w:proofErr w:type="gramEnd"/>
           </w:p>
         </w:tc>
       </w:tr>
@@ -22231,7 +22309,7 @@
           <w:color w:val="auto"/>
         </w:rPr>
       </w:pPr>
-      <w:bookmarkStart w:id="41" w:name="_Toc239352162"/>
+      <w:bookmarkStart w:id="41" w:name="_Toc239360091"/>
       <w:r>
         <w:rPr>
           <w:rFonts w:ascii="Bierstadt Display" w:hAnsi="Bierstadt Display"/>
@@ -23208,7 +23286,7 @@
           <w:color w:val="auto"/>
         </w:rPr>
       </w:pPr>
-      <w:bookmarkStart w:id="42" w:name="_Toc239352163"/>
+      <w:bookmarkStart w:id="42" w:name="_Toc239360092"/>
       <w:r>
         <w:rPr>
           <w:rFonts w:ascii="Bierstadt Display" w:hAnsi="Bierstadt Display"/>
@@ -24568,7 +24646,7 @@
           <w:color w:val="auto"/>
         </w:rPr>
       </w:pPr>
-      <w:bookmarkStart w:id="43" w:name="_Toc239352164"/>
+      <w:bookmarkStart w:id="43" w:name="_Toc239360093"/>
       <w:r>
         <w:rPr>
           <w:rFonts w:ascii="Bierstadt Display" w:hAnsi="Bierstadt Display"/>
@@ -25618,7 +25696,7 @@
           <w:color w:val="auto"/>
         </w:rPr>
       </w:pPr>
-      <w:bookmarkStart w:id="44" w:name="_Toc239352165"/>
+      <w:bookmarkStart w:id="44" w:name="_Toc239360094"/>
       <w:r>
         <w:rPr>
           <w:rFonts w:ascii="Bierstadt Display" w:hAnsi="Bierstadt Display"/>
@@ -26935,7 +27013,7 @@
           <w:color w:val="auto"/>
         </w:rPr>
       </w:pPr>
-      <w:bookmarkStart w:id="45" w:name="_Toc239352166"/>
+      <w:bookmarkStart w:id="45" w:name="_Toc239360095"/>
       <w:r>
         <w:rPr>
           <w:rFonts w:ascii="Bierstadt Display" w:hAnsi="Bierstadt Display"/>
@@ -27765,8 +27843,17 @@
                 <w:rFonts w:ascii="Bierstadt Display" w:eastAsia="Calibri" w:hAnsi="Bierstadt Display"/>
                 <w:sz w:val="18"/>
               </w:rPr>
-              <w:t>Separate capital ask</w:t>
-            </w:r>
+              <w:t xml:space="preserve">Separate capital </w:t>
+            </w:r>
+            <w:proofErr w:type="gramStart"/>
+            <w:r>
+              <w:rPr>
+                <w:rFonts w:ascii="Bierstadt Display" w:eastAsia="Calibri" w:hAnsi="Bierstadt Display"/>
+                <w:sz w:val="18"/>
+              </w:rPr>
+              <w:t>ask</w:t>
+            </w:r>
+            <w:proofErr w:type="gramEnd"/>
           </w:p>
         </w:tc>
       </w:tr>
@@ -27786,7 +27873,7 @@
           <w:color w:val="auto"/>
         </w:rPr>
       </w:pPr>
-      <w:bookmarkStart w:id="46" w:name="_Toc239352167"/>
+      <w:bookmarkStart w:id="46" w:name="_Toc239360096"/>
       <w:r>
         <w:rPr>
           <w:rFonts w:ascii="Bierstadt Display" w:hAnsi="Bierstadt Display"/>
@@ -27983,7 +28070,7 @@
           <w:color w:val="auto"/>
         </w:rPr>
       </w:pPr>
-      <w:bookmarkStart w:id="47" w:name="_Toc239352168"/>
+      <w:bookmarkStart w:id="47" w:name="_Toc239360097"/>
       <w:r>
         <w:rPr>
           <w:rFonts w:ascii="Bierstadt Display" w:hAnsi="Bierstadt Display"/>
@@ -28557,7 +28644,23 @@
           <w:b/>
         </w:rPr>
         <w:lastRenderedPageBreak/>
-        <w:t>Investment ask (pilot stage):</w:t>
+        <w:t xml:space="preserve">Investment </w:t>
+      </w:r>
+      <w:proofErr w:type="gramStart"/>
+      <w:r>
+        <w:rPr>
+          <w:rFonts w:ascii="Bierstadt Display" w:eastAsia="Calibri" w:hAnsi="Bierstadt Display"/>
+          <w:b/>
+        </w:rPr>
+        <w:t>ask</w:t>
+      </w:r>
+      <w:proofErr w:type="gramEnd"/>
+      <w:r>
+        <w:rPr>
+          <w:rFonts w:ascii="Bierstadt Display" w:eastAsia="Calibri" w:hAnsi="Bierstadt Display"/>
+          <w:b/>
+        </w:rPr>
+        <w:t xml:space="preserve"> (pilot stage):</w:t>
       </w:r>
       <w:r>
         <w:rPr>
@@ -28607,7 +28710,7 @@
           <w:color w:val="auto"/>
         </w:rPr>
       </w:pPr>
-      <w:bookmarkStart w:id="48" w:name="_Toc239352169"/>
+      <w:bookmarkStart w:id="48" w:name="_Toc239360098"/>
       <w:r>
         <w:rPr>
           <w:rFonts w:ascii="Bierstadt Display" w:hAnsi="Bierstadt Display"/>
@@ -28670,7 +28773,7 @@
           <w:color w:val="auto"/>
         </w:rPr>
       </w:pPr>
-      <w:bookmarkStart w:id="49" w:name="_Toc239352170"/>
+      <w:bookmarkStart w:id="49" w:name="_Toc239360099"/>
       <w:r>
         <w:rPr>
           <w:rFonts w:ascii="Bierstadt Display" w:hAnsi="Bierstadt Display"/>
@@ -28930,7 +29033,21 @@
         <w:rPr>
           <w:rFonts w:ascii="Bierstadt Display" w:eastAsia="Calibri" w:hAnsi="Bierstadt Display"/>
         </w:rPr>
-        <w:t xml:space="preserve"> repository and Pages demo. https://github.com/Jesyldah/ElimuMatch ; https://jesyldah.github.io/ElimuMatch/</w:t>
+        <w:t xml:space="preserve"> repository and Pages demo. </w:t>
+      </w:r>
+      <w:proofErr w:type="gramStart"/>
+      <w:r>
+        <w:rPr>
+          <w:rFonts w:ascii="Bierstadt Display" w:eastAsia="Calibri" w:hAnsi="Bierstadt Display"/>
+        </w:rPr>
+        <w:t>https://github.com/Jesyldah/ElimuMatch ;</w:t>
+      </w:r>
+      <w:proofErr w:type="gramEnd"/>
+      <w:r>
+        <w:rPr>
+          <w:rFonts w:ascii="Bierstadt Display" w:eastAsia="Calibri" w:hAnsi="Bierstadt Display"/>
+        </w:rPr>
+        <w:t xml:space="preserve"> https://jesyldah.github.io/ElimuMatch/</w:t>
       </w:r>
     </w:p>
     <w:p>
@@ -29153,7 +29270,7 @@
           <w:color w:val="auto"/>
         </w:rPr>
       </w:pPr>
-      <w:bookmarkStart w:id="50" w:name="_Toc239352171"/>
+      <w:bookmarkStart w:id="50" w:name="_Toc239360100"/>
       <w:r>
         <w:rPr>
           <w:rFonts w:ascii="Bierstadt Display" w:hAnsi="Bierstadt Display"/>
@@ -29186,7 +29303,7 @@
           <w:color w:val="auto"/>
         </w:rPr>
       </w:pPr>
-      <w:bookmarkStart w:id="51" w:name="_Toc239352172"/>
+      <w:bookmarkStart w:id="51" w:name="_Toc239360101"/>
       <w:r>
         <w:rPr>
           <w:rFonts w:ascii="Bierstadt Display" w:hAnsi="Bierstadt Display"/>
@@ -29284,7 +29401,7 @@
           <w:color w:val="auto"/>
         </w:rPr>
       </w:pPr>
-      <w:bookmarkStart w:id="52" w:name="_Toc239352173"/>
+      <w:bookmarkStart w:id="52" w:name="_Toc239360102"/>
       <w:r>
         <w:rPr>
           <w:rFonts w:ascii="Bierstadt Display" w:hAnsi="Bierstadt Display"/>
@@ -30621,7 +30738,7 @@
           <w:color w:val="auto"/>
         </w:rPr>
       </w:pPr>
-      <w:bookmarkStart w:id="53" w:name="_Toc239352174"/>
+      <w:bookmarkStart w:id="53" w:name="_Toc239360103"/>
       <w:r>
         <w:rPr>
           <w:rFonts w:ascii="Bierstadt Display" w:hAnsi="Bierstadt Display"/>
@@ -30716,7 +30833,7 @@
           <w:color w:val="auto"/>
         </w:rPr>
       </w:pPr>
-      <w:bookmarkStart w:id="54" w:name="_Toc239352175"/>
+      <w:bookmarkStart w:id="54" w:name="_Toc239360104"/>
       <w:r>
         <w:rPr>
           <w:rFonts w:ascii="Bierstadt Display" w:hAnsi="Bierstadt Display"/>
@@ -30751,7 +30868,21 @@
         <w:rPr>
           <w:rFonts w:ascii="Bierstadt Display" w:eastAsia="Calibri" w:hAnsi="Bierstadt Display"/>
         </w:rPr>
-        <w:t xml:space="preserve">. Approximate test AUC 0.753. Approximate dropout recall 0.667. Majority baseline AUC 0.50. Full leaderboard: </w:t>
+        <w:t xml:space="preserve">. Approximate test AUC 0.753. Approximate dropout </w:t>
+      </w:r>
+      <w:proofErr w:type="gramStart"/>
+      <w:r>
+        <w:rPr>
+          <w:rFonts w:ascii="Bierstadt Display" w:eastAsia="Calibri" w:hAnsi="Bierstadt Display"/>
+        </w:rPr>
+        <w:t>recall</w:t>
+      </w:r>
+      <w:proofErr w:type="gramEnd"/>
+      <w:r>
+        <w:rPr>
+          <w:rFonts w:ascii="Bierstadt Display" w:eastAsia="Calibri" w:hAnsi="Bierstadt Display"/>
+        </w:rPr>
+        <w:t xml:space="preserve"> 0.667. Majority baseline AUC 0.50. Full leaderboard: </w:t>
       </w:r>
       <w:r>
         <w:rPr>
@@ -30775,7 +30906,7 @@
           <w:color w:val="auto"/>
         </w:rPr>
       </w:pPr>
-      <w:bookmarkStart w:id="55" w:name="_Toc239352176"/>
+      <w:bookmarkStart w:id="55" w:name="_Toc239360105"/>
       <w:r>
         <w:rPr>
           <w:rFonts w:ascii="Bierstadt Display" w:hAnsi="Bierstadt Display"/>
@@ -30821,7 +30952,7 @@
           <w:color w:val="auto"/>
         </w:rPr>
       </w:pPr>
-      <w:bookmarkStart w:id="56" w:name="_Toc239352177"/>
+      <w:bookmarkStart w:id="56" w:name="_Toc239360106"/>
       <w:r>
         <w:rPr>
           <w:rFonts w:ascii="Bierstadt Display" w:hAnsi="Bierstadt Display"/>
@@ -30958,7 +31089,7 @@
           <w:color w:val="auto"/>
         </w:rPr>
       </w:pPr>
-      <w:bookmarkStart w:id="57" w:name="_Toc239352178"/>
+      <w:bookmarkStart w:id="57" w:name="_Toc239360107"/>
       <w:r>
         <w:rPr>
           <w:rFonts w:ascii="Bierstadt Display" w:hAnsi="Bierstadt Display"/>
@@ -32017,7 +32148,7 @@
           <w:color w:val="auto"/>
         </w:rPr>
       </w:pPr>
-      <w:bookmarkStart w:id="58" w:name="_Toc239352179"/>
+      <w:bookmarkStart w:id="58" w:name="_Toc239360108"/>
       <w:r>
         <w:rPr>
           <w:rFonts w:ascii="Bierstadt Display" w:hAnsi="Bierstadt Display"/>
@@ -32166,7 +32297,12 @@
       </w:r>
     </w:p>
     <w:sectPr>
-      <w:footerReference w:type="default" r:id="rId32"/>
+      <w:headerReference w:type="even" r:id="rId32"/>
+      <w:headerReference w:type="default" r:id="rId33"/>
+      <w:footerReference w:type="even" r:id="rId34"/>
+      <w:footerReference w:type="default" r:id="rId35"/>
+      <w:headerReference w:type="first" r:id="rId36"/>
+      <w:footerReference w:type="first" r:id="rId37"/>
       <w:pgSz w:w="12240" w:h="15840"/>
       <w:pgMar w:top="1440" w:right="1440" w:bottom="1440" w:left="1440" w:header="720" w:footer="720" w:gutter="0"/>
       <w:cols w:space="720"/>
@@ -32206,15 +32342,35 @@
   <w:p>
     <w:pPr>
       <w:pStyle w:val="Footer"/>
+    </w:pPr>
+  </w:p>
+</w:ftr>
+</file>
+
+<file path=word/footer2.xml><?xml version="1.0" encoding="utf-8"?>
+<w:ftr xmlns:wpc="http://schemas.microsoft.com/office/word/2010/wordprocessingCanvas" xmlns:cx="http://schemas.microsoft.com/office/drawing/2014/chartex" xmlns:cx1="http://schemas.microsoft.com/office/drawing/2015/9/8/chartex" xmlns:cx2="http://schemas.microsoft.com/office/drawing/2015/10/21/chartex" xmlns:cx3="http://schemas.microsoft.com/office/drawing/2016/5/9/chartex" xmlns:cx4="http://schemas.microsoft.com/office/drawing/2016/5/10/chartex" xmlns:cx5="http://schemas.microsoft.com/office/drawing/2016/5/11/chartex" xmlns:cx6="http://schemas.microsoft.com/office/drawing/2016/5/12/chartex" xmlns:cx7="http://schemas.microsoft.com/office/drawing/2016/5/13/chartex" xmlns:cx8="http://schemas.microsoft.com/office/drawing/2016/5/14/chartex" xmlns:mc="http://schemas.openxmlformats.org/markup-compatibility/2006" xmlns:aink="http://schemas.microsoft.com/office/drawing/2016/ink" xmlns:am3d="http://schemas.microsoft.com/office/drawing/2017/model3d" xmlns:o="urn:schemas-microsoft-com:office:office" xmlns:oel="http://schemas.microsoft.com/office/2019/extlst" xmlns:r="http://schemas.openxmlformats.org/officeDocument/2006/relationships" xmlns:m="http://schemas.openxmlformats.org/officeDocument/2006/math" xmlns:v="urn:schemas-microsoft-com:vml" xmlns:wp14="http://schemas.microsoft.com/office/word/2010/wordprocessingDrawing" xmlns:wp="http://schemas.openxmlformats.org/drawingml/2006/wordprocessingDrawing" xmlns:w10="urn:schemas-microsoft-com:office:word" xmlns:w="http://schemas.openxmlformats.org/wordprocessingml/2006/main" xmlns:w14="http://schemas.microsoft.com/office/word/2010/wordml" xmlns:w15="http://schemas.microsoft.com/office/word/2012/wordml" xmlns:w16cex="http://schemas.microsoft.com/office/word/2018/wordml/cex" xmlns:w16cid="http://schemas.microsoft.com/office/word/2016/wordml/cid" xmlns:w16="http://schemas.microsoft.com/office/word/2018/wordml" xmlns:w16sdtdh="http://schemas.microsoft.com/office/word/2020/wordml/sdtdatahash" xmlns:w16se="http://schemas.microsoft.com/office/word/2015/wordml/symex" xmlns:wpg="http://schemas.microsoft.com/office/word/2010/wordprocessingGroup" xmlns:wpi="http://schemas.microsoft.com/office/word/2010/wordprocessingInk" xmlns:wne="http://schemas.microsoft.com/office/word/2006/wordml" xmlns:wps="http://schemas.microsoft.com/office/word/2010/wordprocessingShape" mc:Ignorable="w14 w15 w16se w16cid w16 w16cex w16sdtdh wp14">
+  <w:p>
+    <w:pPr>
+      <w:pStyle w:val="Footer"/>
       <w:jc w:val="center"/>
     </w:pPr>
+    <w:proofErr w:type="gramStart"/>
     <w:r>
       <w:rPr>
         <w:rFonts w:ascii="Calibri" w:eastAsia="Calibri" w:hAnsi="Calibri"/>
         <w:color w:val="555555"/>
         <w:sz w:val="18"/>
       </w:rPr>
-      <w:t xml:space="preserve">ElimuMatch  ·  </w:t>
+      <w:t>ElimuMatch  ·</w:t>
+    </w:r>
+    <w:proofErr w:type="gramEnd"/>
+    <w:r>
+      <w:rPr>
+        <w:rFonts w:ascii="Calibri" w:eastAsia="Calibri" w:hAnsi="Calibri"/>
+        <w:color w:val="555555"/>
+        <w:sz w:val="18"/>
+      </w:rPr>
+      <w:t xml:space="preserve">  </w:t>
     </w:r>
     <w:r>
       <w:rPr>
@@ -32261,6 +32417,16 @@
 </w:ftr>
 </file>
 
+<file path=word/footer3.xml><?xml version="1.0" encoding="utf-8"?>
+<w:ftr xmlns:wpc="http://schemas.microsoft.com/office/word/2010/wordprocessingCanvas" xmlns:cx="http://schemas.microsoft.com/office/drawing/2014/chartex" xmlns:cx1="http://schemas.microsoft.com/office/drawing/2015/9/8/chartex" xmlns:cx2="http://schemas.microsoft.com/office/drawing/2015/10/21/chartex" xmlns:cx3="http://schemas.microsoft.com/office/drawing/2016/5/9/chartex" xmlns:cx4="http://schemas.microsoft.com/office/drawing/2016/5/10/chartex" xmlns:cx5="http://schemas.microsoft.com/office/drawing/2016/5/11/chartex" xmlns:cx6="http://schemas.microsoft.com/office/drawing/2016/5/12/chartex" xmlns:cx7="http://schemas.microsoft.com/office/drawing/2016/5/13/chartex" xmlns:cx8="http://schemas.microsoft.com/office/drawing/2016/5/14/chartex" xmlns:mc="http://schemas.openxmlformats.org/markup-compatibility/2006" xmlns:aink="http://schemas.microsoft.com/office/drawing/2016/ink" xmlns:am3d="http://schemas.microsoft.com/office/drawing/2017/model3d" xmlns:o="urn:schemas-microsoft-com:office:office" xmlns:oel="http://schemas.microsoft.com/office/2019/extlst" xmlns:r="http://schemas.openxmlformats.org/officeDocument/2006/relationships" xmlns:m="http://schemas.openxmlformats.org/officeDocument/2006/math" xmlns:v="urn:schemas-microsoft-com:vml" xmlns:wp14="http://schemas.microsoft.com/office/word/2010/wordprocessingDrawing" xmlns:wp="http://schemas.openxmlformats.org/drawingml/2006/wordprocessingDrawing" xmlns:w10="urn:schemas-microsoft-com:office:word" xmlns:w="http://schemas.openxmlformats.org/wordprocessingml/2006/main" xmlns:w14="http://schemas.microsoft.com/office/word/2010/wordml" xmlns:w15="http://schemas.microsoft.com/office/word/2012/wordml" xmlns:w16cex="http://schemas.microsoft.com/office/word/2018/wordml/cex" xmlns:w16cid="http://schemas.microsoft.com/office/word/2016/wordml/cid" xmlns:w16="http://schemas.microsoft.com/office/word/2018/wordml" xmlns:w16sdtdh="http://schemas.microsoft.com/office/word/2020/wordml/sdtdatahash" xmlns:w16se="http://schemas.microsoft.com/office/word/2015/wordml/symex" xmlns:wpg="http://schemas.microsoft.com/office/word/2010/wordprocessingGroup" xmlns:wpi="http://schemas.microsoft.com/office/word/2010/wordprocessingInk" xmlns:wne="http://schemas.microsoft.com/office/word/2006/wordml" xmlns:wps="http://schemas.microsoft.com/office/word/2010/wordprocessingShape" mc:Ignorable="w14 w15 w16se w16cid w16 w16cex w16sdtdh wp14">
+  <w:p>
+    <w:pPr>
+      <w:pStyle w:val="Footer"/>
+    </w:pPr>
+  </w:p>
+</w:ftr>
+</file>
+
 <file path=word/footnotes.xml><?xml version="1.0" encoding="utf-8"?>
 <w:footnotes xmlns:wpc="http://schemas.microsoft.com/office/word/2010/wordprocessingCanvas" xmlns:cx="http://schemas.microsoft.com/office/drawing/2014/chartex" xmlns:cx1="http://schemas.microsoft.com/office/drawing/2015/9/8/chartex" xmlns:cx2="http://schemas.microsoft.com/office/drawing/2015/10/21/chartex" xmlns:cx3="http://schemas.microsoft.com/office/drawing/2016/5/9/chartex" xmlns:cx4="http://schemas.microsoft.com/office/drawing/2016/5/10/chartex" xmlns:cx5="http://schemas.microsoft.com/office/drawing/2016/5/11/chartex" xmlns:cx6="http://schemas.microsoft.com/office/drawing/2016/5/12/chartex" xmlns:cx7="http://schemas.microsoft.com/office/drawing/2016/5/13/chartex" xmlns:cx8="http://schemas.microsoft.com/office/drawing/2016/5/14/chartex" xmlns:mc="http://schemas.openxmlformats.org/markup-compatibility/2006" xmlns:aink="http://schemas.microsoft.com/office/drawing/2016/ink" xmlns:am3d="http://schemas.microsoft.com/office/drawing/2017/model3d" xmlns:o="urn:schemas-microsoft-com:office:office" xmlns:oel="http://schemas.microsoft.com/office/2019/extlst" xmlns:r="http://schemas.openxmlformats.org/officeDocument/2006/relationships" xmlns:m="http://schemas.openxmlformats.org/officeDocument/2006/math" xmlns:v="urn:schemas-microsoft-com:vml" xmlns:wp14="http://schemas.microsoft.com/office/word/2010/wordprocessingDrawing" xmlns:wp="http://schemas.openxmlformats.org/drawingml/2006/wordprocessingDrawing" xmlns:w10="urn:schemas-microsoft-com:office:word" xmlns:w="http://schemas.openxmlformats.org/wordprocessingml/2006/main" xmlns:w14="http://schemas.microsoft.com/office/word/2010/wordml" xmlns:w15="http://schemas.microsoft.com/office/word/2012/wordml" xmlns:w16cex="http://schemas.microsoft.com/office/word/2018/wordml/cex" xmlns:w16cid="http://schemas.microsoft.com/office/word/2016/wordml/cid" xmlns:w16="http://schemas.microsoft.com/office/word/2018/wordml" xmlns:w16sdtdh="http://schemas.microsoft.com/office/word/2020/wordml/sdtdatahash" xmlns:w16se="http://schemas.microsoft.com/office/word/2015/wordml/symex" xmlns:wpg="http://schemas.microsoft.com/office/word/2010/wordprocessingGroup" xmlns:wpi="http://schemas.microsoft.com/office/word/2010/wordprocessingInk" xmlns:wne="http://schemas.microsoft.com/office/word/2006/wordml" xmlns:wps="http://schemas.microsoft.com/office/word/2010/wordprocessingShape" mc:Ignorable="w14 w15 w16se w16cid w16 w16cex w16sdtdh wp14">
   <w:footnote w:type="separator" w:id="-1">
@@ -32284,6 +32450,36 @@
     </w:p>
   </w:footnote>
 </w:footnotes>
+</file>
+
+<file path=word/header1.xml><?xml version="1.0" encoding="utf-8"?>
+<w:hdr xmlns:wpc="http://schemas.microsoft.com/office/word/2010/wordprocessingCanvas" xmlns:cx="http://schemas.microsoft.com/office/drawing/2014/chartex" xmlns:cx1="http://schemas.microsoft.com/office/drawing/2015/9/8/chartex" xmlns:cx2="http://schemas.microsoft.com/office/drawing/2015/10/21/chartex" xmlns:cx3="http://schemas.microsoft.com/office/drawing/2016/5/9/chartex" xmlns:cx4="http://schemas.microsoft.com/office/drawing/2016/5/10/chartex" xmlns:cx5="http://schemas.microsoft.com/office/drawing/2016/5/11/chartex" xmlns:cx6="http://schemas.microsoft.com/office/drawing/2016/5/12/chartex" xmlns:cx7="http://schemas.microsoft.com/office/drawing/2016/5/13/chartex" xmlns:cx8="http://schemas.microsoft.com/office/drawing/2016/5/14/chartex" xmlns:mc="http://schemas.openxmlformats.org/markup-compatibility/2006" xmlns:aink="http://schemas.microsoft.com/office/drawing/2016/ink" xmlns:am3d="http://schemas.microsoft.com/office/drawing/2017/model3d" xmlns:o="urn:schemas-microsoft-com:office:office" xmlns:oel="http://schemas.microsoft.com/office/2019/extlst" xmlns:r="http://schemas.openxmlformats.org/officeDocument/2006/relationships" xmlns:m="http://schemas.openxmlformats.org/officeDocument/2006/math" xmlns:v="urn:schemas-microsoft-com:vml" xmlns:wp14="http://schemas.microsoft.com/office/word/2010/wordprocessingDrawing" xmlns:wp="http://schemas.openxmlformats.org/drawingml/2006/wordprocessingDrawing" xmlns:w10="urn:schemas-microsoft-com:office:word" xmlns:w="http://schemas.openxmlformats.org/wordprocessingml/2006/main" xmlns:w14="http://schemas.microsoft.com/office/word/2010/wordml" xmlns:w15="http://schemas.microsoft.com/office/word/2012/wordml" xmlns:w16cex="http://schemas.microsoft.com/office/word/2018/wordml/cex" xmlns:w16cid="http://schemas.microsoft.com/office/word/2016/wordml/cid" xmlns:w16="http://schemas.microsoft.com/office/word/2018/wordml" xmlns:w16sdtdh="http://schemas.microsoft.com/office/word/2020/wordml/sdtdatahash" xmlns:w16se="http://schemas.microsoft.com/office/word/2015/wordml/symex" xmlns:wpg="http://schemas.microsoft.com/office/word/2010/wordprocessingGroup" xmlns:wpi="http://schemas.microsoft.com/office/word/2010/wordprocessingInk" xmlns:wne="http://schemas.microsoft.com/office/word/2006/wordml" xmlns:wps="http://schemas.microsoft.com/office/word/2010/wordprocessingShape" mc:Ignorable="w14 w15 w16se w16cid w16 w16cex w16sdtdh wp14">
+  <w:p>
+    <w:pPr>
+      <w:pStyle w:val="Header"/>
+    </w:pPr>
+  </w:p>
+</w:hdr>
+</file>
+
+<file path=word/header2.xml><?xml version="1.0" encoding="utf-8"?>
+<w:hdr xmlns:wpc="http://schemas.microsoft.com/office/word/2010/wordprocessingCanvas" xmlns:cx="http://schemas.microsoft.com/office/drawing/2014/chartex" xmlns:cx1="http://schemas.microsoft.com/office/drawing/2015/9/8/chartex" xmlns:cx2="http://schemas.microsoft.com/office/drawing/2015/10/21/chartex" xmlns:cx3="http://schemas.microsoft.com/office/drawing/2016/5/9/chartex" xmlns:cx4="http://schemas.microsoft.com/office/drawing/2016/5/10/chartex" xmlns:cx5="http://schemas.microsoft.com/office/drawing/2016/5/11/chartex" xmlns:cx6="http://schemas.microsoft.com/office/drawing/2016/5/12/chartex" xmlns:cx7="http://schemas.microsoft.com/office/drawing/2016/5/13/chartex" xmlns:cx8="http://schemas.microsoft.com/office/drawing/2016/5/14/chartex" xmlns:mc="http://schemas.openxmlformats.org/markup-compatibility/2006" xmlns:aink="http://schemas.microsoft.com/office/drawing/2016/ink" xmlns:am3d="http://schemas.microsoft.com/office/drawing/2017/model3d" xmlns:o="urn:schemas-microsoft-com:office:office" xmlns:oel="http://schemas.microsoft.com/office/2019/extlst" xmlns:r="http://schemas.openxmlformats.org/officeDocument/2006/relationships" xmlns:m="http://schemas.openxmlformats.org/officeDocument/2006/math" xmlns:v="urn:schemas-microsoft-com:vml" xmlns:wp14="http://schemas.microsoft.com/office/word/2010/wordprocessingDrawing" xmlns:wp="http://schemas.openxmlformats.org/drawingml/2006/wordprocessingDrawing" xmlns:w10="urn:schemas-microsoft-com:office:word" xmlns:w="http://schemas.openxmlformats.org/wordprocessingml/2006/main" xmlns:w14="http://schemas.microsoft.com/office/word/2010/wordml" xmlns:w15="http://schemas.microsoft.com/office/word/2012/wordml" xmlns:w16cex="http://schemas.microsoft.com/office/word/2018/wordml/cex" xmlns:w16cid="http://schemas.microsoft.com/office/word/2016/wordml/cid" xmlns:w16="http://schemas.microsoft.com/office/word/2018/wordml" xmlns:w16sdtdh="http://schemas.microsoft.com/office/word/2020/wordml/sdtdatahash" xmlns:w16se="http://schemas.microsoft.com/office/word/2015/wordml/symex" xmlns:wpg="http://schemas.microsoft.com/office/word/2010/wordprocessingGroup" xmlns:wpi="http://schemas.microsoft.com/office/word/2010/wordprocessingInk" xmlns:wne="http://schemas.microsoft.com/office/word/2006/wordml" xmlns:wps="http://schemas.microsoft.com/office/word/2010/wordprocessingShape" mc:Ignorable="w14 w15 w16se w16cid w16 w16cex w16sdtdh wp14">
+  <w:p>
+    <w:pPr>
+      <w:pStyle w:val="Header"/>
+    </w:pPr>
+  </w:p>
+</w:hdr>
+</file>
+
+<file path=word/header3.xml><?xml version="1.0" encoding="utf-8"?>
+<w:hdr xmlns:wpc="http://schemas.microsoft.com/office/word/2010/wordprocessingCanvas" xmlns:cx="http://schemas.microsoft.com/office/drawing/2014/chartex" xmlns:cx1="http://schemas.microsoft.com/office/drawing/2015/9/8/chartex" xmlns:cx2="http://schemas.microsoft.com/office/drawing/2015/10/21/chartex" xmlns:cx3="http://schemas.microsoft.com/office/drawing/2016/5/9/chartex" xmlns:cx4="http://schemas.microsoft.com/office/drawing/2016/5/10/chartex" xmlns:cx5="http://schemas.microsoft.com/office/drawing/2016/5/11/chartex" xmlns:cx6="http://schemas.microsoft.com/office/drawing/2016/5/12/chartex" xmlns:cx7="http://schemas.microsoft.com/office/drawing/2016/5/13/chartex" xmlns:cx8="http://schemas.microsoft.com/office/drawing/2016/5/14/chartex" xmlns:mc="http://schemas.openxmlformats.org/markup-compatibility/2006" xmlns:aink="http://schemas.microsoft.com/office/drawing/2016/ink" xmlns:am3d="http://schemas.microsoft.com/office/drawing/2017/model3d" xmlns:o="urn:schemas-microsoft-com:office:office" xmlns:oel="http://schemas.microsoft.com/office/2019/extlst" xmlns:r="http://schemas.openxmlformats.org/officeDocument/2006/relationships" xmlns:m="http://schemas.openxmlformats.org/officeDocument/2006/math" xmlns:v="urn:schemas-microsoft-com:vml" xmlns:wp14="http://schemas.microsoft.com/office/word/2010/wordprocessingDrawing" xmlns:wp="http://schemas.openxmlformats.org/drawingml/2006/wordprocessingDrawing" xmlns:w10="urn:schemas-microsoft-com:office:word" xmlns:w="http://schemas.openxmlformats.org/wordprocessingml/2006/main" xmlns:w14="http://schemas.microsoft.com/office/word/2010/wordml" xmlns:w15="http://schemas.microsoft.com/office/word/2012/wordml" xmlns:w16cex="http://schemas.microsoft.com/office/word/2018/wordml/cex" xmlns:w16cid="http://schemas.microsoft.com/office/word/2016/wordml/cid" xmlns:w16="http://schemas.microsoft.com/office/word/2018/wordml" xmlns:w16sdtdh="http://schemas.microsoft.com/office/word/2020/wordml/sdtdatahash" xmlns:w16se="http://schemas.microsoft.com/office/word/2015/wordml/symex" xmlns:wpg="http://schemas.microsoft.com/office/word/2010/wordprocessingGroup" xmlns:wpi="http://schemas.microsoft.com/office/word/2010/wordprocessingInk" xmlns:wne="http://schemas.microsoft.com/office/word/2006/wordml" xmlns:wps="http://schemas.microsoft.com/office/word/2010/wordprocessingShape" mc:Ignorable="w14 w15 w16se w16cid w16 w16cex w16sdtdh wp14">
+  <w:p>
+    <w:pPr>
+      <w:pStyle w:val="Header"/>
+    </w:pPr>
+  </w:p>
+</w:hdr>
 </file>
 
 <file path=word/numbering.xml><?xml version="1.0" encoding="utf-8"?>

</xml_diff>